<commit_message>
Rewrite Feedback5 response in the terse register used in earlier rounds
Matched the item-level style of the previous feedback responses: noun/
"~로 확인 / ~로 정정 / ~함" endings instead of full polite sentences, so the
document reads as a point-by-point log. Content unchanged. Rebuilt
Feedback5_Response.docx.

Co-Authored-By: Claude Opus 5 <noreply@anthropic.com>
Claude-Session: https://claude.ai/code/session_01CuLT4FKRBtsU22Vwfjj2qn
</commit_message>
<xml_diff>
--- a/meta_agents/search_v2/outputs/Feedback5_Response.docx
+++ b/meta_agents/search_v2/outputs/Feedback5_Response.docx
@@ -15,7 +15,7 @@
           <w:sz w:val="20"/>
           <w:szCs w:val="20"/>
         </w:rPr>
-        <w:t xml:space="preserve">본 응답은 5차 피드백의 각 항목에 대해 수정 내용과 근거를 정리한 것입니다. 모든 수치는 수정 후 재생성한 최종 데이터에서 다시 계산한 값이며, 표·그림·보충자료·제출 문서는 동일한 추출표에서 함께 재생성했습니다.</w:t>
+        <w:t xml:space="preserve">5차 피드백 각 항목에 대한 수정 내용과 근거. 모든 수치는 수정 후 재생성한 최종 데이터에서 재계산한 값이며, 표·그림·보충자료·제출 문서는 동일한 추출표에서 함께 재생성.</w:t>
       </w:r>
     </w:p>
     <w:p>
@@ -52,18 +52,18 @@
           <w:sz w:val="20"/>
           <w:szCs w:val="20"/>
         </w:rPr>
-        <w:t xml:space="preserve">Miller 2008의 자료원·coverage 정정</w:t>
-      </w:r>
-      <w:r>
-        <w:rPr>
-          <w:rFonts w:ascii="Malgun Gothic" w:cs="Malgun Gothic" w:eastAsia="Malgun Gothic" w:hAnsi="Malgun Gothic"/>
-          <w:b w:val="false"/>
-          <w:bCs w:val="false"/>
-          <w:color w:val="000000"/>
-          <w:sz w:val="20"/>
-          <w:szCs w:val="20"/>
-        </w:rPr>
-        <w:t xml:space="preserve">: 원문을 다시 확인한 결과 "Native Hawaiian rates calculated only for the state of Hawaii"로, Hawaii Tumor Registry가 Native Hawaiian 혈통을 가진 모든 환자를 분류하는 노력 때문에 Native Hawaiian 발생률만 Hawaii 주로 한정해 보고하고 있었습니다. 지적대로 Table 1과 Supplementary Table 4의 "NAACCR/CiNA (~93%)" 표기는 과대 기재였으므로 자료원을 </w:t>
+        <w:t xml:space="preserve">Miller 2008 자료원·coverage 정정</w:t>
+      </w:r>
+      <w:r>
+        <w:rPr>
+          <w:rFonts w:ascii="Malgun Gothic" w:cs="Malgun Gothic" w:eastAsia="Malgun Gothic" w:hAnsi="Malgun Gothic"/>
+          <w:b w:val="false"/>
+          <w:bCs w:val="false"/>
+          <w:color w:val="000000"/>
+          <w:sz w:val="20"/>
+          <w:szCs w:val="20"/>
+        </w:rPr>
+        <w:t xml:space="preserve">: 원문 "Native Hawaiian rates calculated only for the state of Hawaii"로 확인 — Hawaii Tumor Registry가 Native Hawaiian 혈통 환자를 전수 분류하기 때문에 Native Hawaiian 발생률만 Hawaii 주로 한정 보고. Table 1·Supplementary Table 4의 "NAACCR/CiNA (~93%)"는 과대 기재였으므로 </w:t>
       </w:r>
       <w:r>
         <w:rPr>
@@ -85,7 +85,7 @@
           <w:sz w:val="20"/>
           <w:szCs w:val="20"/>
         </w:rPr>
-        <w:t xml:space="preserve">로 정정하고, 자료원 라벨도 `NAACCR-API` → `HTR`로 맞춰 라벨과 coverage 분류가 어긋나지 않게 했습니다.</w:t>
+        <w:t xml:space="preserve">로 정정하고, 자료원 라벨도 `NAACCR-API` → `HTR`로 맞춰 라벨-coverage 불일치 제거.</w:t>
       </w:r>
     </w:p>
     <w:p>
@@ -117,29 +117,29 @@
           <w:sz w:val="20"/>
           <w:szCs w:val="20"/>
         </w:rPr>
-        <w:t xml:space="preserve">: coverage가 정정되면서 기존 선정 규칙(전국 SEER &gt; 단일 주 레지스트리)이 그대로 적용되어, Gomez 2026(SEER-21, 2018–2022) </w:t>
-      </w:r>
-      <w:r>
-        <w:rPr>
-          <w:rFonts w:ascii="Malgun Gothic" w:cs="Malgun Gothic" w:eastAsia="Malgun Gothic" w:hAnsi="Malgun Gothic"/>
-          <w:b/>
-          <w:bCs/>
-          <w:color w:val="000000"/>
-          <w:sz w:val="20"/>
-          <w:szCs w:val="20"/>
-        </w:rPr>
-        <w:t xml:space="preserve">1.27 [1.21–1.33]</w:t>
-      </w:r>
-      <w:r>
-        <w:rPr>
-          <w:rFonts w:ascii="Malgun Gothic" w:cs="Malgun Gothic" w:eastAsia="Malgun Gothic" w:hAnsi="Malgun Gothic"/>
-          <w:b w:val="false"/>
-          <w:bCs w:val="false"/>
-          <w:color w:val="000000"/>
-          <w:sz w:val="20"/>
-          <w:szCs w:val="20"/>
-        </w:rPr>
-        <w:t xml:space="preserve">이 대표가 되고 Miller 2008(1.21 [1.12–1.31])은 sensitivity overlap으로 이동했습니다. Results와 Discussion의 Native Hawaiian 값을 1.21 → </w:t>
+        <w:t xml:space="preserve">: coverage 정정으로 기존 선정 규칙(전국 SEER &gt; 단일 주)이 그대로 적용 → </w:t>
+      </w:r>
+      <w:r>
+        <w:rPr>
+          <w:rFonts w:ascii="Malgun Gothic" w:cs="Malgun Gothic" w:eastAsia="Malgun Gothic" w:hAnsi="Malgun Gothic"/>
+          <w:b/>
+          <w:bCs/>
+          <w:color w:val="000000"/>
+          <w:sz w:val="20"/>
+          <w:szCs w:val="20"/>
+        </w:rPr>
+        <w:t xml:space="preserve">Gomez 2026(SEER-21, 2018–2022) 1.27 [1.21–1.33]</w:t>
+      </w:r>
+      <w:r>
+        <w:rPr>
+          <w:rFonts w:ascii="Malgun Gothic" w:cs="Malgun Gothic" w:eastAsia="Malgun Gothic" w:hAnsi="Malgun Gothic"/>
+          <w:b w:val="false"/>
+          <w:bCs w:val="false"/>
+          <w:color w:val="000000"/>
+          <w:sz w:val="20"/>
+          <w:szCs w:val="20"/>
+        </w:rPr>
+        <w:t xml:space="preserve">이 대표, Miller 2008(1.21 [1.12–1.31])은 sensitivity overlap으로 이동. Results·Discussion의 Native Hawaiian 값 1.21 → </w:t>
       </w:r>
       <w:r>
         <w:rPr>
@@ -161,7 +161,7 @@
           <w:sz w:val="20"/>
           <w:szCs w:val="20"/>
         </w:rPr>
-        <w:t xml:space="preserve">로 갱신했습니다. NHPI aggregate 1.21은 Gomez 2026이 보고한 별개 값이므로 변동이 없습니다.</w:t>
+        <w:t xml:space="preserve"> 갱신. NHPI aggregate 1.21은 Gomez 2026이 보고한 별개 값이므로 불변.</w:t>
       </w:r>
     </w:p>
     <w:p>
@@ -193,7 +193,7 @@
           <w:sz w:val="20"/>
           <w:szCs w:val="20"/>
         </w:rPr>
-        <w:t xml:space="preserve">: 대표값을 공급한 연구가 23 → </w:t>
+        <w:t xml:space="preserve">: 대표값 공급 연구 23 → </w:t>
       </w:r>
       <w:r>
         <w:rPr>
@@ -215,7 +215,7 @@
           <w:sz w:val="20"/>
           <w:szCs w:val="20"/>
         </w:rPr>
-        <w:t xml:space="preserve">, overlap 전용이 35 → </w:t>
+        <w:t xml:space="preserve">, overlap 전용 35 → </w:t>
       </w:r>
       <w:r>
         <w:rPr>
@@ -237,7 +237,7 @@
           <w:sz w:val="20"/>
           <w:szCs w:val="20"/>
         </w:rPr>
-        <w:t xml:space="preserve">이 되었고, 저위험 제한 민감도분석은 unchanged/changed/dropped가 60/13/12 → </w:t>
+        <w:t xml:space="preserve">, 저위험 제한 민감도 60/13/12 → </w:t>
       </w:r>
       <w:r>
         <w:rPr>
@@ -259,7 +259,7 @@
           <w:sz w:val="20"/>
           <w:szCs w:val="20"/>
         </w:rPr>
-        <w:t xml:space="preserve">로 바뀌었습니다. 헤드라인 aggregate IRR(Hispanic 0.72·AANHPI 0.77·AI/AN 0.87·NHB 0.93, NHB TNBC 1.95)은 영향을 받지 않았습니다.</w:t>
+        <w:t xml:space="preserve">(unchanged/changed/dropped). 헤드라인 aggregate IRR(Hispanic 0.72·AANHPI 0.77·AI/AN 0.87·NHB 0.93, NHB TNBC 1.95)은 불변.</w:t>
       </w:r>
     </w:p>
     <w:p>
@@ -280,40 +280,18 @@
           <w:sz w:val="20"/>
           <w:szCs w:val="20"/>
         </w:rPr>
-        <w:t xml:space="preserve">Kong 2020의 비교 방향 정정</w:t>
-      </w:r>
-      <w:r>
-        <w:rPr>
-          <w:rFonts w:ascii="Malgun Gothic" w:cs="Malgun Gothic" w:eastAsia="Malgun Gothic" w:hAnsi="Malgun Gothic"/>
-          <w:b w:val="false"/>
-          <w:bCs w:val="false"/>
-          <w:color w:val="000000"/>
-          <w:sz w:val="20"/>
-          <w:szCs w:val="20"/>
-        </w:rPr>
-        <w:t xml:space="preserve">: 원문은 "non-Hispanic White women was 31.3 …, which was higher compared with the incidence among Black women (IRR, 1.04; 95% CI, 1.02–1.05)"로 </w:t>
-      </w:r>
-      <w:r>
-        <w:rPr>
-          <w:rFonts w:ascii="Malgun Gothic" w:cs="Malgun Gothic" w:eastAsia="Malgun Gothic" w:hAnsi="Malgun Gothic"/>
-          <w:b/>
-          <w:bCs/>
-          <w:color w:val="000000"/>
-          <w:sz w:val="20"/>
-          <w:szCs w:val="20"/>
-        </w:rPr>
-        <w:t xml:space="preserve">overall 값만 NHW를 분자로</w:t>
-      </w:r>
-      <w:r>
-        <w:rPr>
-          <w:rFonts w:ascii="Malgun Gothic" w:cs="Malgun Gothic" w:eastAsia="Malgun Gothic" w:hAnsi="Malgun Gothic"/>
-          <w:b w:val="false"/>
-          <w:bCs w:val="false"/>
-          <w:color w:val="000000"/>
-          <w:sz w:val="20"/>
-          <w:szCs w:val="20"/>
-        </w:rPr>
-        <w:t xml:space="preserve"> 서술하고, 같은 문단의 다른 aggregate는 minority를 분자로 보고합니다(Asian/PI 0.90, AI/AN 0.82, Hispanic 0.79). 즉 한 논문 안에서 방향이 섞여 있었습니다. 지적대로 일관되게 반영하기 위해 해당 행을 </w:t>
+        <w:t xml:space="preserve">Kong 2020 비교 방향 정정</w:t>
+      </w:r>
+      <w:r>
+        <w:rPr>
+          <w:rFonts w:ascii="Malgun Gothic" w:cs="Malgun Gothic" w:eastAsia="Malgun Gothic" w:hAnsi="Malgun Gothic"/>
+          <w:b w:val="false"/>
+          <w:bCs w:val="false"/>
+          <w:color w:val="000000"/>
+          <w:sz w:val="20"/>
+          <w:szCs w:val="20"/>
+        </w:rPr>
+        <w:t xml:space="preserve">: 원문이 overall만 NHW를 분자로 서술("non-Hispanic White women was 31.3 …, which was higher compared with the incidence among Black women (IRR, 1.04; 95% CI, 1.02–1.05)")하고 같은 문단의 다른 aggregate는 minority 기준(Asian/PI 0.90, AI/AN 0.82, Hispanic 0.79)임을 확인 — 한 논문 내 방향 혼재. 해당 행을 </w:t>
       </w:r>
       <w:r>
         <w:rPr>
@@ -335,7 +313,7 @@
           <w:sz w:val="20"/>
           <w:szCs w:val="20"/>
         </w:rPr>
-        <w:t xml:space="preserve">로 역수 변환하고 provenance를 `directly-reported-IRR-inverted`로 표기했으며, Supplementary Note 1에 남아 있던 "방향이 모호하여 미기록"이라는 설명도 실제 처리(역수 변환)와 일치하게 고쳤습니다. 역수 후 값은 같은 셀의 다른 추정치 분포(0.81–0.98)와 대표값 Ellington 2022(0.933), 동시기 SEER 추정치(Du 0.937·Gomez 0.941·Davis Lynn 0.971)에 부합합니다.</w:t>
+        <w:t xml:space="preserve">로 역수 변환하고 provenance를 `directly-reported-IRR-inverted`로 표기. Supplementary Note 1의 "방향 모호로 미기록" 설명도 실제 처리(역수)와 일치하게 수정. 역수 후 값은 같은 셀 분포(0.81–0.98)·대표값 Ellington 2022(0.933)·동시기 SEER 추정치(Du 0.937, Gomez 0.941, Davis Lynn 0.971)와 정합.</w:t>
       </w:r>
     </w:p>
     <w:p>
@@ -367,7 +345,7 @@
           <w:sz w:val="20"/>
           <w:szCs w:val="20"/>
         </w:rPr>
-        <w:t xml:space="preserve">: 같은 문제가 다른 연구에도 있는지 추출표 전체를 점검했습니다. 발생률에서 계산한 122행은 minority ÷ NHW로 방향이 고정되며 내부 점검에서 원문 발생률로 재검증됩니다. 원문 보고값 98행 중 같은 셀에 추정치가 3개 이상 있어 상호 대조가 가능한 행에서 방향 이탈 후보 3건이 검출되었으나, Nash 2022는 외부 NHW 기준을 사용한 계산값이고, Wingo 2008은 원문이 national 0.63·Northern Plains 0.89·Southern Plains 0.89·Alaska 0.99로 모두 minority 기준이며, Zahnd 2019는 원문이 "non-Hispanic Black women had … higher rates than non-Hispanic White women (RR = 1.07; 95% CI 1.04–1.11)"로 확인되어 세 건 모두 방향이 정확했습니다. 셀 내 대조가 불가능한 33행 중 1을 넘는 9행도 NHB 여성의 40세·50세 미만 교차(1.01–1.16)와 Asian/Hispanic/AI·AN의 HR−/HER2+ 아형(1.04–1.41)처럼 알려진 소견과 부합합니다. 결과적으로 방향 반전이 필요한 행은 Kong 2020의 overall Black 한 건이었습니다.</w:t>
+        <w:t xml:space="preserve">: 같은 문제의 잔존 여부를 추출표 전체로 점검. 발생률에서 계산한 122행은 minority ÷ NHW로 방향이 고정되고 내부 점검에서 원문 발생률로 재검증됨. 원문 보고값 98행 중 같은 셀에 추정치가 3개 이상 있어 상호 대조가 가능한 행에서 방향 이탈 후보 3건 검출 → Nash 2022는 외부 NHW 기준을 쓴 계산값, Wingo 2008은 원문이 national 0.63·Northern Plains 0.89·Southern Plains 0.89·Alaska 0.99로 모두 minority 기준, Zahnd 2019는 원문 "non-Hispanic Black women had … higher rates than non-Hispanic White women (RR = 1.07; 95% CI 1.04–1.11)"로 확인되어 3건 모두 방향 정확. 셀 내 대조가 불가능한 33행 중 1을 넘는 9행도 NHB 여성의 40세·50세 미만 교차(1.01–1.16), Asian/Hispanic/AI·AN의 HR−/HER2+ 아형(1.04–1.41) 등 알려진 소견과 부합. 방향 반전이 필요한 행은 Kong 2020 overall Black 1건.</w:t>
       </w:r>
     </w:p>
     <w:sectPr>

</xml_diff>

<commit_message>
Order the Feedback5 response sections by feedback item number
Sections had been appended in the order the items were worked (1, 2, 5, 3);
reordered to 1, 2, 3, 5 so the response follows the feedback's own
numbering, and later items will be inserted in place.

Co-Authored-By: Claude Opus 5 <noreply@anthropic.com>
Claude-Session: https://claude.ai/code/session_01CuLT4FKRBtsU22Vwfjj2qn
</commit_message>
<xml_diff>
--- a/meta_agents/search_v2/outputs/Feedback5_Response.docx
+++ b/meta_agents/search_v2/outputs/Feedback5_Response.docx
@@ -887,7 +887,7 @@
           <w:sz w:val="24"/>
           <w:szCs w:val="24"/>
         </w:rPr>
-        <w:t xml:space="preserve">5. 연구의 포함·제외 및 synthesis 분류 기준을 통일해주세요.</w:t>
+        <w:t xml:space="preserve">3. 민감도분석의 조건과 실제 결과를 일치시켜주세요.</w:t>
       </w:r>
     </w:p>
     <w:p>
@@ -908,260 +908,62 @@
           <w:sz w:val="20"/>
           <w:szCs w:val="20"/>
         </w:rPr>
-        <w:t xml:space="preserve">중복 제외 vs 서술적 종합 잔류 — 구분 원리를 Methods에 명시</w:t>
-      </w:r>
-      <w:r>
-        <w:rPr>
-          <w:rFonts w:ascii="Malgun Gothic" w:cs="Malgun Gothic" w:eastAsia="Malgun Gothic" w:hAnsi="Malgun Gothic"/>
-          <w:b w:val="false"/>
-          <w:bCs w:val="false"/>
-          <w:color w:val="000000"/>
-          <w:sz w:val="20"/>
-          <w:szCs w:val="20"/>
-        </w:rPr>
-        <w:t xml:space="preserve">: 종전 Methods는 "같은 registry·기간·인구의 재보고는 제외"만 기술해, 같은 사유가 적힌 연구가 narrative로 남아 있는 것과 어긋났음. 실제 판정 기준은 </w:t>
-      </w:r>
-      <w:r>
-        <w:rPr>
-          <w:rFonts w:ascii="Malgun Gothic" w:cs="Malgun Gothic" w:eastAsia="Malgun Gothic" w:hAnsi="Malgun Gothic"/>
-          <w:b/>
-          <w:bCs/>
-          <w:color w:val="000000"/>
-          <w:sz w:val="20"/>
-          <w:szCs w:val="20"/>
-        </w:rPr>
-        <w:t xml:space="preserve">"이미 포함된 다른 출판물이 그 내용을 담고 있는가"</w:t>
-      </w:r>
-      <w:r>
-        <w:rPr>
-          <w:rFonts w:ascii="Malgun Gothic" w:cs="Malgun Gothic" w:eastAsia="Malgun Gothic" w:hAnsi="Malgun Gothic"/>
-          <w:b w:val="false"/>
-          <w:bCs w:val="false"/>
-          <w:color w:val="000000"/>
-          <w:sz w:val="20"/>
-          <w:szCs w:val="20"/>
-        </w:rPr>
-        <w:t xml:space="preserve">였으므로 이를 원리로 명시하고 두 경우를 구분해 서술: ① 재보고는 독립 추정치가 아니어서 </w:t>
-      </w:r>
-      <w:r>
-        <w:rPr>
-          <w:rFonts w:ascii="Malgun Gothic" w:cs="Malgun Gothic" w:eastAsia="Malgun Gothic" w:hAnsi="Malgun Gothic"/>
-          <w:b/>
-          <w:bCs/>
-          <w:color w:val="000000"/>
-          <w:sz w:val="20"/>
-          <w:szCs w:val="20"/>
-        </w:rPr>
-        <w:t xml:space="preserve">어느 경우에도 대표값 후보가 되지 않음</w:t>
-      </w:r>
-      <w:r>
-        <w:rPr>
-          <w:rFonts w:ascii="Malgun Gothic" w:cs="Malgun Gothic" w:eastAsia="Malgun Gothic" w:hAnsi="Malgun Gothic"/>
-          <w:b w:val="false"/>
-          <w:bCs w:val="false"/>
-          <w:color w:val="000000"/>
-          <w:sz w:val="20"/>
-          <w:szCs w:val="20"/>
-        </w:rPr>
-        <w:t xml:space="preserve">; ② 그중 포함된 다른 출판물이 내용을 이미 담은 것(같은 시리즈의 </w:t>
-      </w:r>
-      <w:r>
-        <w:rPr>
-          <w:rFonts w:ascii="Malgun Gothic" w:cs="Malgun Gothic" w:eastAsia="Malgun Gothic" w:hAnsi="Malgun Gothic"/>
-          <w:b/>
-          <w:bCs/>
-          <w:color w:val="000000"/>
-          <w:sz w:val="20"/>
-          <w:szCs w:val="20"/>
-        </w:rPr>
-        <w:t xml:space="preserve">이전 연도판</w:t>
-      </w:r>
-      <w:r>
-        <w:rPr>
-          <w:rFonts w:ascii="Malgun Gothic" w:cs="Malgun Gothic" w:eastAsia="Malgun Gothic" w:hAnsi="Malgun Gothic"/>
-          <w:b w:val="false"/>
-          <w:bCs w:val="false"/>
-          <w:color w:val="000000"/>
-          <w:sz w:val="20"/>
-          <w:szCs w:val="20"/>
-        </w:rPr>
-        <w:t xml:space="preserve">, 포함된 분석의 </w:t>
-      </w:r>
-      <w:r>
-        <w:rPr>
-          <w:rFonts w:ascii="Malgun Gothic" w:cs="Malgun Gothic" w:eastAsia="Malgun Gothic" w:hAnsi="Malgun Gothic"/>
-          <w:b/>
-          <w:bCs/>
-          <w:color w:val="000000"/>
-          <w:sz w:val="20"/>
-          <w:szCs w:val="20"/>
-        </w:rPr>
-        <w:t xml:space="preserve">preprint·book-chapter판</w:t>
-      </w:r>
-      <w:r>
-        <w:rPr>
-          <w:rFonts w:ascii="Malgun Gothic" w:cs="Malgun Gothic" w:eastAsia="Malgun Gothic" w:hAnsi="Malgun Gothic"/>
-          <w:b w:val="false"/>
-          <w:bCs w:val="false"/>
-          <w:color w:val="000000"/>
-          <w:sz w:val="20"/>
-          <w:szCs w:val="20"/>
-        </w:rPr>
-        <w:t xml:space="preserve">)은 리뷰에 새 정보를 더하지 않으므로 </w:t>
-      </w:r>
-      <w:r>
-        <w:rPr>
-          <w:rFonts w:ascii="Malgun Gothic" w:cs="Malgun Gothic" w:eastAsia="Malgun Gothic" w:hAnsi="Malgun Gothic"/>
-          <w:b/>
-          <w:bCs/>
-          <w:color w:val="000000"/>
-          <w:sz w:val="20"/>
-          <w:szCs w:val="20"/>
-        </w:rPr>
-        <w:t xml:space="preserve">제외</w:t>
-      </w:r>
-      <w:r>
-        <w:rPr>
-          <w:rFonts w:ascii="Malgun Gothic" w:cs="Malgun Gothic" w:eastAsia="Malgun Gothic" w:hAnsi="Malgun Gothic"/>
-          <w:b w:val="false"/>
-          <w:bCs w:val="false"/>
-          <w:color w:val="000000"/>
-          <w:sz w:val="20"/>
-          <w:szCs w:val="20"/>
-        </w:rPr>
-        <w:t xml:space="preserve">(중복 55편 중 51편이 연례 통계 시리즈 이전판, 4편이 preprint·book-chapter 중복); ③ 반면 </w:t>
-      </w:r>
-      <w:r>
-        <w:rPr>
-          <w:rFonts w:ascii="Malgun Gothic" w:cs="Malgun Gothic" w:eastAsia="Malgun Gothic" w:hAnsi="Malgun Gothic"/>
-          <w:b/>
-          <w:bCs/>
-          <w:color w:val="000000"/>
-          <w:sz w:val="20"/>
-          <w:szCs w:val="20"/>
-        </w:rPr>
-        <w:t xml:space="preserve">시리즈의 최신 적격판</w:t>
-      </w:r>
-      <w:r>
-        <w:rPr>
-          <w:rFonts w:ascii="Malgun Gothic" w:cs="Malgun Gothic" w:eastAsia="Malgun Gothic" w:hAnsi="Malgun Gothic"/>
-          <w:b w:val="false"/>
-          <w:bCs w:val="false"/>
-          <w:color w:val="000000"/>
-          <w:sz w:val="20"/>
-          <w:szCs w:val="20"/>
-        </w:rPr>
-        <w:t xml:space="preserve">은 그 시리즈의 현재 서술을 담은 유일한 판이므로 리뷰에는 포함하되, 해당 registry·기간의 발생률은 전담 primary 연구가 이미 제공하므로 </w:t>
-      </w:r>
-      <w:r>
-        <w:rPr>
-          <w:rFonts w:ascii="Malgun Gothic" w:cs="Malgun Gothic" w:eastAsia="Malgun Gothic" w:hAnsi="Malgun Gothic"/>
-          <w:b/>
-          <w:bCs/>
-          <w:color w:val="000000"/>
-          <w:sz w:val="20"/>
-          <w:szCs w:val="20"/>
-        </w:rPr>
-        <w:t xml:space="preserve">서술적 종합에만 기여</w:t>
-      </w:r>
-      <w:r>
-        <w:rPr>
-          <w:rFonts w:ascii="Malgun Gothic" w:cs="Malgun Gothic" w:eastAsia="Malgun Gothic" w:hAnsi="Malgun Gothic"/>
-          <w:b w:val="false"/>
-          <w:bCs w:val="false"/>
-          <w:color w:val="000000"/>
-          <w:sz w:val="20"/>
-          <w:szCs w:val="20"/>
-        </w:rPr>
-        <w:t xml:space="preserve">; ④ 같은 registry family라도 기간·지역·subset이 다르면 별개 추정치로 보아 </w:t>
-      </w:r>
-      <w:r>
-        <w:rPr>
-          <w:rFonts w:ascii="Malgun Gothic" w:cs="Malgun Gothic" w:eastAsia="Malgun Gothic" w:hAnsi="Malgun Gothic"/>
-          <w:b/>
-          <w:bCs/>
-          <w:color w:val="000000"/>
-          <w:sz w:val="20"/>
-          <w:szCs w:val="20"/>
-        </w:rPr>
-        <w:t xml:space="preserve">민감도 overlap으로 유지</w:t>
-      </w:r>
-      <w:r>
-        <w:rPr>
-          <w:rFonts w:ascii="Malgun Gothic" w:cs="Malgun Gothic" w:eastAsia="Malgun Gothic" w:hAnsi="Malgun Gothic"/>
-          <w:b w:val="false"/>
-          <w:bCs w:val="false"/>
-          <w:color w:val="000000"/>
-          <w:sz w:val="20"/>
-          <w:szCs w:val="20"/>
-        </w:rPr>
-        <w:t xml:space="preserve">. 이로써 Giaquinto 2024(rec 0)와 Saka 2025(rec 4294)가 narrative에 남는 근거와, 같은 시리즈 이전판들이 제외된 근거가 하나의 기준으로 설명됨. 참고로 제외된 83편 중 51편이 연례 통계 시리즈의 </w:t>
-      </w:r>
-      <w:r>
-        <w:rPr>
-          <w:rFonts w:ascii="Malgun Gothic" w:cs="Malgun Gothic" w:eastAsia="Malgun Gothic" w:hAnsi="Malgun Gothic"/>
-          <w:b/>
-          <w:bCs/>
-          <w:color w:val="000000"/>
-          <w:sz w:val="20"/>
-          <w:szCs w:val="20"/>
-        </w:rPr>
-        <w:t xml:space="preserve">이전 연도판</w:t>
-      </w:r>
-      <w:r>
-        <w:rPr>
-          <w:rFonts w:ascii="Malgun Gothic" w:cs="Malgun Gothic" w:eastAsia="Malgun Gothic" w:hAnsi="Malgun Gothic"/>
-          <w:b w:val="false"/>
-          <w:bCs w:val="false"/>
-          <w:color w:val="000000"/>
-          <w:sz w:val="20"/>
-          <w:szCs w:val="20"/>
-        </w:rPr>
-        <w:t xml:space="preserve">(Breast cancer statistics 2015·2019, Cancer statistics for African Americans 2016·2022, Annual Report to the Nation 1973–1999 ~ 1975–2014 등)임을 확인. 즉 실제로는 "</w:t>
-      </w:r>
-      <w:r>
-        <w:rPr>
-          <w:rFonts w:ascii="Malgun Gothic" w:cs="Malgun Gothic" w:eastAsia="Malgun Gothic" w:hAnsi="Malgun Gothic"/>
-          <w:b/>
-          <w:bCs/>
-          <w:color w:val="000000"/>
-          <w:sz w:val="20"/>
-          <w:szCs w:val="20"/>
-        </w:rPr>
-        <w:t xml:space="preserve">시리즈별로 최신 적격판 1편만 남기고 이전 판은 중복으로 제외</w:t>
-      </w:r>
-      <w:r>
-        <w:rPr>
-          <w:rFonts w:ascii="Malgun Gothic" w:cs="Malgun Gothic" w:eastAsia="Malgun Gothic" w:hAnsi="Malgun Gothic"/>
-          <w:b w:val="false"/>
-          <w:bCs w:val="false"/>
-          <w:color w:val="000000"/>
-          <w:sz w:val="20"/>
-          <w:szCs w:val="20"/>
-        </w:rPr>
-        <w:t xml:space="preserve">"하는 규칙이 적용되고 있었으나 Methods에 서술되지 않아 지적된 불일치가 발생. Methods 적격기준에 해당 규칙과, </w:t>
-      </w:r>
-      <w:r>
-        <w:rPr>
-          <w:rFonts w:ascii="Malgun Gothic" w:cs="Malgun Gothic" w:eastAsia="Malgun Gothic" w:hAnsi="Malgun Gothic"/>
-          <w:b/>
-          <w:bCs/>
-          <w:color w:val="000000"/>
-          <w:sz w:val="20"/>
-          <w:szCs w:val="20"/>
-        </w:rPr>
-        <w:t xml:space="preserve">남긴 최신판은 해당 registry·기간의 발생률을 전담 primary 연구가 이미 제공하므로 대표값 후보로 쓰지 않고 서술적 종합에만 기여</w:t>
-      </w:r>
-      <w:r>
-        <w:rPr>
-          <w:rFonts w:ascii="Malgun Gothic" w:cs="Malgun Gothic" w:eastAsia="Malgun Gothic" w:hAnsi="Malgun Gothic"/>
-          <w:b w:val="false"/>
-          <w:bCs w:val="false"/>
-          <w:color w:val="000000"/>
-          <w:sz w:val="20"/>
-          <w:szCs w:val="20"/>
-        </w:rPr>
-        <w:t xml:space="preserve">한다는 점을 명시. 이로써 Giaquinto 2024(rec 0, Breast cancer statistics 2024)와 Saka 2025(rec 4294, Cancer statistics for African American and Black people 2025)가 같은 사유로 narrative에 남는 근거가 드러남.</w:t>
+        <w:t xml:space="preserve">Goggins 2009 SIR — 조건과 코드 불일치 정정</w:t>
+      </w:r>
+      <w:r>
+        <w:rPr>
+          <w:rFonts w:ascii="Malgun Gothic" w:cs="Malgun Gothic" w:eastAsia="Malgun Gothic" w:hAnsi="Malgun Gothic"/>
+          <w:b w:val="false"/>
+          <w:bCs w:val="false"/>
+          <w:color w:val="000000"/>
+          <w:sz w:val="20"/>
+          <w:szCs w:val="20"/>
+        </w:rPr>
+        <w:t xml:space="preserve">: Methods는 SIR이 간접표준화이므로 directly-reported-IRR 민감도에서 제외한다고 서술했으나, 코드의 필터 집합이 `{directly-reported-IRR, directly-reported-SIR}`로 </w:t>
+      </w:r>
+      <w:r>
+        <w:rPr>
+          <w:rFonts w:ascii="Malgun Gothic" w:cs="Malgun Gothic" w:eastAsia="Malgun Gothic" w:hAnsi="Malgun Gothic"/>
+          <w:b/>
+          <w:bCs/>
+          <w:color w:val="000000"/>
+          <w:sz w:val="20"/>
+          <w:szCs w:val="20"/>
+        </w:rPr>
+        <w:t xml:space="preserve">SIR을 포함</w:t>
+      </w:r>
+      <w:r>
+        <w:rPr>
+          <w:rFonts w:ascii="Malgun Gothic" w:cs="Malgun Gothic" w:eastAsia="Malgun Gothic" w:hAnsi="Malgun Gothic"/>
+          <w:b w:val="false"/>
+          <w:bCs w:val="false"/>
+          <w:color w:val="000000"/>
+          <w:sz w:val="20"/>
+          <w:szCs w:val="20"/>
+        </w:rPr>
+        <w:t xml:space="preserve">하고 표 제목도 "IRR/SIR only"였음. 지적대로 코드를 Methods에 맞춰 필터에서 SIR을 제거하고, 표 제목·캡션·Note를 "directly reported IRR only(간접표준화 SIR 제외)"로 수정. 그 결과 Goggins 2009의 0.61 [0.56–0.66]이 Table 6b에서 빠지고 Asian Indian/Pakistani 셀은 dropped로 이동 → </w:t>
+      </w:r>
+      <w:r>
+        <w:rPr>
+          <w:rFonts w:ascii="Malgun Gothic" w:cs="Malgun Gothic" w:eastAsia="Malgun Gothic" w:hAnsi="Malgun Gothic"/>
+          <w:b/>
+          <w:bCs/>
+          <w:color w:val="000000"/>
+          <w:sz w:val="20"/>
+          <w:szCs w:val="20"/>
+        </w:rPr>
+        <w:t xml:space="preserve">6b 결과가 35 unchanged / 5 changed / 45 dropped → 35 unchanged / 4 changed / 46 dropped</w:t>
+      </w:r>
+      <w:r>
+        <w:rPr>
+          <w:rFonts w:ascii="Malgun Gothic" w:cs="Malgun Gothic" w:eastAsia="Malgun Gothic" w:hAnsi="Malgun Gothic"/>
+          <w:b w:val="false"/>
+          <w:bCs w:val="false"/>
+          <w:color w:val="000000"/>
+          <w:sz w:val="20"/>
+          <w:szCs w:val="20"/>
+        </w:rPr>
+        <w:t xml:space="preserve">로 갱신(Results 서술도 함께 수정). 한편 Kong 2020의 역수 변환 행(item 1)은 원문 보고값의 방향만 바꾼 것이어서 계산 유도값과 구분해 directly-reported 계열에 포함시키고, 그 처리 근거를 코드 주석과 Note에 명시.</w:t>
       </w:r>
     </w:p>
     <w:p>
@@ -1182,40 +984,40 @@
           <w:sz w:val="20"/>
           <w:szCs w:val="20"/>
         </w:rPr>
-        <w:t xml:space="preserve">Li 2025 분류 사유 수정</w:t>
-      </w:r>
-      <w:r>
-        <w:rPr>
-          <w:rFonts w:ascii="Malgun Gothic" w:cs="Malgun Gothic" w:eastAsia="Malgun Gothic" w:hAnsi="Malgun Gothic"/>
-          <w:b w:val="false"/>
-          <w:bCs w:val="false"/>
-          <w:color w:val="000000"/>
-          <w:sz w:val="20"/>
-          <w:szCs w:val="20"/>
-        </w:rPr>
-        <w:t xml:space="preserve">: 해당 연구는 rec 46(JAMA Netw Open 2025, SEER 22개 레지스트리 2010–2019, joinpoint 연간변화율 분석)으로 확인. 종전 표기 "single poolable estimate가 아님"은 pooling을 하지 않는 현재 분석 방식과 맞지 않으므로, 실제 사유인 </w:t>
-      </w:r>
-      <w:r>
-        <w:rPr>
-          <w:rFonts w:ascii="Malgun Gothic" w:cs="Malgun Gothic" w:eastAsia="Malgun Gothic" w:hAnsi="Malgun Gothic"/>
-          <w:b/>
-          <w:bCs/>
-          <w:color w:val="000000"/>
-          <w:sz w:val="20"/>
-          <w:szCs w:val="20"/>
-        </w:rPr>
-        <w:t xml:space="preserve">"연간 추세(annual percentage change)로만 보고해 단면 연령표준화율·비율을 추출할 수 없음"</w:t>
-      </w:r>
-      <w:r>
-        <w:rPr>
-          <w:rFonts w:ascii="Malgun Gothic" w:cs="Malgun Gothic" w:eastAsia="Malgun Gothic" w:hAnsi="Malgun Gothic"/>
-          <w:b w:val="false"/>
-          <w:bCs w:val="false"/>
-          <w:color w:val="000000"/>
-          <w:sz w:val="20"/>
-          <w:szCs w:val="20"/>
-        </w:rPr>
-        <w:t xml:space="preserve">으로 교체.</w:t>
+        <w:t xml:space="preserve">제외된 cell 전부 제시</w:t>
+      </w:r>
+      <w:r>
+        <w:rPr>
+          <w:rFonts w:ascii="Malgun Gothic" w:cs="Malgun Gothic" w:eastAsia="Malgun Gothic" w:hAnsi="Malgun Gothic"/>
+          <w:b w:val="false"/>
+          <w:bCs w:val="false"/>
+          <w:color w:val="000000"/>
+          <w:sz w:val="20"/>
+          <w:szCs w:val="20"/>
+        </w:rPr>
+        <w:t xml:space="preserve">: Table 6b만 changed 셀만 싣고 dropped를 생략하고 있었음(6a·6c·6d는 이미 changed·dropped 모두 제시). 6b도 dropped를 모두 포함하도록 수정해 </w:t>
+      </w:r>
+      <w:r>
+        <w:rPr>
+          <w:rFonts w:ascii="Malgun Gothic" w:cs="Malgun Gothic" w:eastAsia="Malgun Gothic" w:hAnsi="Malgun Gothic"/>
+          <w:b/>
+          <w:bCs/>
+          <w:color w:val="000000"/>
+          <w:sz w:val="20"/>
+          <w:szCs w:val="20"/>
+        </w:rPr>
+        <w:t xml:space="preserve">네 표 모두 changed·dropped 전 cell을 제시</w:t>
+      </w:r>
+      <w:r>
+        <w:rPr>
+          <w:rFonts w:ascii="Malgun Gothic" w:cs="Malgun Gothic" w:eastAsia="Malgun Gothic" w:hAnsi="Malgun Gothic"/>
+          <w:b w:val="false"/>
+          <w:bCs w:val="false"/>
+          <w:color w:val="000000"/>
+          <w:sz w:val="20"/>
+          <w:szCs w:val="20"/>
+        </w:rPr>
+        <w:t xml:space="preserve">(보충표 행 수 624 → 669).</w:t>
       </w:r>
     </w:p>
     <w:p>
@@ -1236,62 +1038,40 @@
           <w:sz w:val="20"/>
           <w:szCs w:val="20"/>
         </w:rPr>
-        <w:t xml:space="preserve">Supplementary Table 2의 narrative 사유 전면 실제화</w:t>
-      </w:r>
-      <w:r>
-        <w:rPr>
-          <w:rFonts w:ascii="Malgun Gothic" w:cs="Malgun Gothic" w:eastAsia="Malgun Gothic" w:hAnsi="Malgun Gothic"/>
-          <w:b w:val="false"/>
-          <w:bCs w:val="false"/>
-          <w:color w:val="000000"/>
-          <w:sz w:val="20"/>
-          <w:szCs w:val="20"/>
-        </w:rPr>
-        <w:t xml:space="preserve">: 점검 결과 narrative 118편 중 </w:t>
-      </w:r>
-      <w:r>
-        <w:rPr>
-          <w:rFonts w:ascii="Malgun Gothic" w:cs="Malgun Gothic" w:eastAsia="Malgun Gothic" w:hAnsi="Malgun Gothic"/>
-          <w:b/>
-          <w:bCs/>
-          <w:color w:val="000000"/>
-          <w:sz w:val="20"/>
-          <w:szCs w:val="20"/>
-        </w:rPr>
-        <w:t xml:space="preserve">103편이 "No recoverable NHW comparison" 한 문구로 일괄 표시</w:t>
-      </w:r>
-      <w:r>
-        <w:rPr>
-          <w:rFonts w:ascii="Malgun Gothic" w:cs="Malgun Gothic" w:eastAsia="Malgun Gothic" w:hAnsi="Malgun Gothic"/>
-          <w:b w:val="false"/>
-          <w:bCs w:val="false"/>
-          <w:color w:val="000000"/>
-          <w:sz w:val="20"/>
-          <w:szCs w:val="20"/>
-        </w:rPr>
-        <w:t xml:space="preserve">되고 있었음(개별 사유 부여는 15편). 실제 사유는 시리즈 재보고 9, 추세만 28, 사회경제적 비교 6, 비미국 비교군 5, 비율 아님(PIR 등) 5, 그림 전용 4 등으로 다양하므로, 적격성 기록에 사유가 있는 경우 그 사유를 유형별 문구로 표시하도록 수정 → </w:t>
-      </w:r>
-      <w:r>
-        <w:rPr>
-          <w:rFonts w:ascii="Malgun Gothic" w:cs="Malgun Gothic" w:eastAsia="Malgun Gothic" w:hAnsi="Malgun Gothic"/>
-          <w:b/>
-          <w:bCs/>
-          <w:color w:val="000000"/>
-          <w:sz w:val="20"/>
-          <w:szCs w:val="20"/>
-        </w:rPr>
-        <w:t xml:space="preserve">개별 사유 표시가 15편에서 57편으로 확대</w:t>
-      </w:r>
-      <w:r>
-        <w:rPr>
-          <w:rFonts w:ascii="Malgun Gothic" w:cs="Malgun Gothic" w:eastAsia="Malgun Gothic" w:hAnsi="Malgun Gothic"/>
-          <w:b w:val="false"/>
-          <w:bCs w:val="false"/>
-          <w:color w:val="000000"/>
-          <w:sz w:val="20"/>
-          <w:szCs w:val="20"/>
-        </w:rPr>
-        <w:t xml:space="preserve">. 사유 기록이 없는 나머지는 포괄 사유("NHW 기준 연령표준화율·비율을 복구할 수 없음")로 표시하고, 어떤 경우에 개별 사유가 표시되고 어떤 경우에 포괄 사유가 표시되는지를 Supplementary Table 2 Note에 명시.</w:t>
+        <w:t xml:space="preserve">변경 전후 출처 연구 표시</w:t>
+      </w:r>
+      <w:r>
+        <w:rPr>
+          <w:rFonts w:ascii="Malgun Gothic" w:cs="Malgun Gothic" w:eastAsia="Malgun Gothic" w:hAnsi="Malgun Gothic"/>
+          <w:b w:val="false"/>
+          <w:bCs w:val="false"/>
+          <w:color w:val="000000"/>
+          <w:sz w:val="20"/>
+          <w:szCs w:val="20"/>
+        </w:rPr>
+        <w:t xml:space="preserve">: 네 표의 값 컬럼에 해당 추정치를 공급한 연구를 병기하도록 변경 — "Main analysis: IRR [95% CI] — study"와 "Under restriction: IRR [95% CI] — study". 따라서 changed 셀에서는 </w:t>
+      </w:r>
+      <w:r>
+        <w:rPr>
+          <w:rFonts w:ascii="Malgun Gothic" w:cs="Malgun Gothic" w:eastAsia="Malgun Gothic" w:hAnsi="Malgun Gothic"/>
+          <w:b/>
+          <w:bCs/>
+          <w:color w:val="000000"/>
+          <w:sz w:val="20"/>
+          <w:szCs w:val="20"/>
+        </w:rPr>
+        <w:t xml:space="preserve">교체된 연구와 교체한 연구가 한 행에서 함께</w:t>
+      </w:r>
+      <w:r>
+        <w:rPr>
+          <w:rFonts w:ascii="Malgun Gothic" w:cs="Malgun Gothic" w:eastAsia="Malgun Gothic" w:hAnsi="Malgun Gothic"/>
+          <w:b w:val="false"/>
+          <w:bCs w:val="false"/>
+          <w:color w:val="000000"/>
+          <w:sz w:val="20"/>
+          <w:szCs w:val="20"/>
+        </w:rPr>
+        <w:t xml:space="preserve"> 보이고(예: Japanese 아형 셀에서 Gomez 2026 → Jin 2016), dropped 셀은 "not available under this restriction"으로 표시.</w:t>
       </w:r>
     </w:p>
     <w:p>
@@ -1312,40 +1092,62 @@
           <w:sz w:val="20"/>
           <w:szCs w:val="20"/>
         </w:rPr>
-        <w:t xml:space="preserve">대표값 선정 단위 표기 통일</w:t>
-      </w:r>
-      <w:r>
-        <w:rPr>
-          <w:rFonts w:ascii="Malgun Gothic" w:cs="Malgun Gothic" w:eastAsia="Malgun Gothic" w:hAnsi="Malgun Gothic"/>
-          <w:b w:val="false"/>
-          <w:bCs w:val="false"/>
-          <w:color w:val="000000"/>
-          <w:sz w:val="20"/>
-          <w:szCs w:val="20"/>
-        </w:rPr>
-        <w:t xml:space="preserve">: Introduction("one representative population-based estimate per registry family"), Table 1 Note("one per registry family"), 본문 표·그림 Note에 남아 있던 </w:t>
-      </w:r>
-      <w:r>
-        <w:rPr>
-          <w:rFonts w:ascii="Malgun Gothic" w:cs="Malgun Gothic" w:eastAsia="Malgun Gothic" w:hAnsi="Malgun Gothic"/>
-          <w:b/>
-          <w:bCs/>
-          <w:color w:val="000000"/>
-          <w:sz w:val="20"/>
-          <w:szCs w:val="20"/>
-        </w:rPr>
-        <w:t xml:space="preserve">"per registry family"를 Methods의 "per analytic cell"로 통일</w:t>
-      </w:r>
-      <w:r>
-        <w:rPr>
-          <w:rFonts w:ascii="Malgun Gothic" w:cs="Malgun Gothic" w:eastAsia="Malgun Gothic" w:hAnsi="Malgun Gothic"/>
-          <w:b w:val="false"/>
-          <w:bCs w:val="false"/>
-          <w:color w:val="000000"/>
-          <w:sz w:val="20"/>
-          <w:szCs w:val="20"/>
-        </w:rPr>
-        <w:t xml:space="preserve">. registry family는 셀 내부의 중복 판정 단위로만 쓰인다는 점을 작성 지침에도 반영.</w:t>
+        <w:t xml:space="preserve">dropped cell 해석 주의 명시</w:t>
+      </w:r>
+      <w:r>
+        <w:rPr>
+          <w:rFonts w:ascii="Malgun Gothic" w:cs="Malgun Gothic" w:eastAsia="Malgun Gothic" w:hAnsi="Malgun Gothic"/>
+          <w:b w:val="false"/>
+          <w:bCs w:val="false"/>
+          <w:color w:val="000000"/>
+          <w:sz w:val="20"/>
+          <w:szCs w:val="20"/>
+        </w:rPr>
+        <w:t xml:space="preserve">: 제한을 충족하지 못해 제외된 cell을 견고성 확인으로 읽지 않도록, Supplementary Table 6 Note에 "dropped cell은 그 제한 하에서 </w:t>
+      </w:r>
+      <w:r>
+        <w:rPr>
+          <w:rFonts w:ascii="Malgun Gothic" w:cs="Malgun Gothic" w:eastAsia="Malgun Gothic" w:hAnsi="Malgun Gothic"/>
+          <w:b/>
+          <w:bCs/>
+          <w:color w:val="000000"/>
+          <w:sz w:val="20"/>
+          <w:szCs w:val="20"/>
+        </w:rPr>
+        <w:t xml:space="preserve">검증되지 않은(untested)</w:t>
+      </w:r>
+      <w:r>
+        <w:rPr>
+          <w:rFonts w:ascii="Malgun Gothic" w:cs="Malgun Gothic" w:eastAsia="Malgun Gothic" w:hAnsi="Malgun Gothic"/>
+          <w:b w:val="false"/>
+          <w:bCs w:val="false"/>
+          <w:color w:val="000000"/>
+          <w:sz w:val="20"/>
+          <w:szCs w:val="20"/>
+        </w:rPr>
+        <w:t xml:space="preserve"> 것이며 확인된 것이 아니다"를 명시. Discussion의 민감도 서술도 "대부분의 차이가 불일치가 아니라 자격 미충족에 따른 drop"이라는 안심형 표현을 걷어내고, </w:t>
+      </w:r>
+      <w:r>
+        <w:rPr>
+          <w:rFonts w:ascii="Malgun Gothic" w:cs="Malgun Gothic" w:eastAsia="Malgun Gothic" w:hAnsi="Malgun Gothic"/>
+          <w:b/>
+          <w:bCs/>
+          <w:color w:val="000000"/>
+          <w:sz w:val="20"/>
+          <w:szCs w:val="20"/>
+        </w:rPr>
+        <w:t xml:space="preserve">각 제한이 재검토할 수 있었던 cell에 한해 패턴이 유지되었으며 directly-reported 제한만으로도 85개 중 46개 cell이 미검토로 남는다</w:t>
+      </w:r>
+      <w:r>
+        <w:rPr>
+          <w:rFonts w:ascii="Malgun Gothic" w:cs="Malgun Gothic" w:eastAsia="Malgun Gothic" w:hAnsi="Malgun Gothic"/>
+          <w:b w:val="false"/>
+          <w:bCs w:val="false"/>
+          <w:color w:val="000000"/>
+          <w:sz w:val="20"/>
+          <w:szCs w:val="20"/>
+        </w:rPr>
+        <w:t xml:space="preserve">는 사실을 함께 기술.</w:t>
       </w:r>
     </w:p>
     <w:p>
@@ -1361,7 +1163,7 @@
           <w:sz w:val="24"/>
           <w:szCs w:val="24"/>
         </w:rPr>
-        <w:t xml:space="preserve">3. 민감도분석의 조건과 실제 결과를 일치시켜주세요.</w:t>
+        <w:t xml:space="preserve">5. 연구의 포함·제외 및 synthesis 분류 기준을 통일해주세요.</w:t>
       </w:r>
     </w:p>
     <w:p>
@@ -1382,62 +1184,260 @@
           <w:sz w:val="20"/>
           <w:szCs w:val="20"/>
         </w:rPr>
-        <w:t xml:space="preserve">Goggins 2009 SIR — 조건과 코드 불일치 정정</w:t>
-      </w:r>
-      <w:r>
-        <w:rPr>
-          <w:rFonts w:ascii="Malgun Gothic" w:cs="Malgun Gothic" w:eastAsia="Malgun Gothic" w:hAnsi="Malgun Gothic"/>
-          <w:b w:val="false"/>
-          <w:bCs w:val="false"/>
-          <w:color w:val="000000"/>
-          <w:sz w:val="20"/>
-          <w:szCs w:val="20"/>
-        </w:rPr>
-        <w:t xml:space="preserve">: Methods는 SIR이 간접표준화이므로 directly-reported-IRR 민감도에서 제외한다고 서술했으나, 코드의 필터 집합이 `{directly-reported-IRR, directly-reported-SIR}`로 </w:t>
-      </w:r>
-      <w:r>
-        <w:rPr>
-          <w:rFonts w:ascii="Malgun Gothic" w:cs="Malgun Gothic" w:eastAsia="Malgun Gothic" w:hAnsi="Malgun Gothic"/>
-          <w:b/>
-          <w:bCs/>
-          <w:color w:val="000000"/>
-          <w:sz w:val="20"/>
-          <w:szCs w:val="20"/>
-        </w:rPr>
-        <w:t xml:space="preserve">SIR을 포함</w:t>
-      </w:r>
-      <w:r>
-        <w:rPr>
-          <w:rFonts w:ascii="Malgun Gothic" w:cs="Malgun Gothic" w:eastAsia="Malgun Gothic" w:hAnsi="Malgun Gothic"/>
-          <w:b w:val="false"/>
-          <w:bCs w:val="false"/>
-          <w:color w:val="000000"/>
-          <w:sz w:val="20"/>
-          <w:szCs w:val="20"/>
-        </w:rPr>
-        <w:t xml:space="preserve">하고 표 제목도 "IRR/SIR only"였음. 지적대로 코드를 Methods에 맞춰 필터에서 SIR을 제거하고, 표 제목·캡션·Note를 "directly reported IRR only(간접표준화 SIR 제외)"로 수정. 그 결과 Goggins 2009의 0.61 [0.56–0.66]이 Table 6b에서 빠지고 Asian Indian/Pakistani 셀은 dropped로 이동 → </w:t>
-      </w:r>
-      <w:r>
-        <w:rPr>
-          <w:rFonts w:ascii="Malgun Gothic" w:cs="Malgun Gothic" w:eastAsia="Malgun Gothic" w:hAnsi="Malgun Gothic"/>
-          <w:b/>
-          <w:bCs/>
-          <w:color w:val="000000"/>
-          <w:sz w:val="20"/>
-          <w:szCs w:val="20"/>
-        </w:rPr>
-        <w:t xml:space="preserve">6b 결과가 35 unchanged / 5 changed / 45 dropped → 35 unchanged / 4 changed / 46 dropped</w:t>
-      </w:r>
-      <w:r>
-        <w:rPr>
-          <w:rFonts w:ascii="Malgun Gothic" w:cs="Malgun Gothic" w:eastAsia="Malgun Gothic" w:hAnsi="Malgun Gothic"/>
-          <w:b w:val="false"/>
-          <w:bCs w:val="false"/>
-          <w:color w:val="000000"/>
-          <w:sz w:val="20"/>
-          <w:szCs w:val="20"/>
-        </w:rPr>
-        <w:t xml:space="preserve">로 갱신(Results 서술도 함께 수정). 한편 Kong 2020의 역수 변환 행(item 1)은 원문 보고값의 방향만 바꾼 것이어서 계산 유도값과 구분해 directly-reported 계열에 포함시키고, 그 처리 근거를 코드 주석과 Note에 명시.</w:t>
+        <w:t xml:space="preserve">중복 제외 vs 서술적 종합 잔류 — 구분 원리를 Methods에 명시</w:t>
+      </w:r>
+      <w:r>
+        <w:rPr>
+          <w:rFonts w:ascii="Malgun Gothic" w:cs="Malgun Gothic" w:eastAsia="Malgun Gothic" w:hAnsi="Malgun Gothic"/>
+          <w:b w:val="false"/>
+          <w:bCs w:val="false"/>
+          <w:color w:val="000000"/>
+          <w:sz w:val="20"/>
+          <w:szCs w:val="20"/>
+        </w:rPr>
+        <w:t xml:space="preserve">: 종전 Methods는 "같은 registry·기간·인구의 재보고는 제외"만 기술해, 같은 사유가 적힌 연구가 narrative로 남아 있는 것과 어긋났음. 실제 판정 기준은 </w:t>
+      </w:r>
+      <w:r>
+        <w:rPr>
+          <w:rFonts w:ascii="Malgun Gothic" w:cs="Malgun Gothic" w:eastAsia="Malgun Gothic" w:hAnsi="Malgun Gothic"/>
+          <w:b/>
+          <w:bCs/>
+          <w:color w:val="000000"/>
+          <w:sz w:val="20"/>
+          <w:szCs w:val="20"/>
+        </w:rPr>
+        <w:t xml:space="preserve">"이미 포함된 다른 출판물이 그 내용을 담고 있는가"</w:t>
+      </w:r>
+      <w:r>
+        <w:rPr>
+          <w:rFonts w:ascii="Malgun Gothic" w:cs="Malgun Gothic" w:eastAsia="Malgun Gothic" w:hAnsi="Malgun Gothic"/>
+          <w:b w:val="false"/>
+          <w:bCs w:val="false"/>
+          <w:color w:val="000000"/>
+          <w:sz w:val="20"/>
+          <w:szCs w:val="20"/>
+        </w:rPr>
+        <w:t xml:space="preserve">였으므로 이를 원리로 명시하고 두 경우를 구분해 서술: ① 재보고는 독립 추정치가 아니어서 </w:t>
+      </w:r>
+      <w:r>
+        <w:rPr>
+          <w:rFonts w:ascii="Malgun Gothic" w:cs="Malgun Gothic" w:eastAsia="Malgun Gothic" w:hAnsi="Malgun Gothic"/>
+          <w:b/>
+          <w:bCs/>
+          <w:color w:val="000000"/>
+          <w:sz w:val="20"/>
+          <w:szCs w:val="20"/>
+        </w:rPr>
+        <w:t xml:space="preserve">어느 경우에도 대표값 후보가 되지 않음</w:t>
+      </w:r>
+      <w:r>
+        <w:rPr>
+          <w:rFonts w:ascii="Malgun Gothic" w:cs="Malgun Gothic" w:eastAsia="Malgun Gothic" w:hAnsi="Malgun Gothic"/>
+          <w:b w:val="false"/>
+          <w:bCs w:val="false"/>
+          <w:color w:val="000000"/>
+          <w:sz w:val="20"/>
+          <w:szCs w:val="20"/>
+        </w:rPr>
+        <w:t xml:space="preserve">; ② 그중 포함된 다른 출판물이 내용을 이미 담은 것(같은 시리즈의 </w:t>
+      </w:r>
+      <w:r>
+        <w:rPr>
+          <w:rFonts w:ascii="Malgun Gothic" w:cs="Malgun Gothic" w:eastAsia="Malgun Gothic" w:hAnsi="Malgun Gothic"/>
+          <w:b/>
+          <w:bCs/>
+          <w:color w:val="000000"/>
+          <w:sz w:val="20"/>
+          <w:szCs w:val="20"/>
+        </w:rPr>
+        <w:t xml:space="preserve">이전 연도판</w:t>
+      </w:r>
+      <w:r>
+        <w:rPr>
+          <w:rFonts w:ascii="Malgun Gothic" w:cs="Malgun Gothic" w:eastAsia="Malgun Gothic" w:hAnsi="Malgun Gothic"/>
+          <w:b w:val="false"/>
+          <w:bCs w:val="false"/>
+          <w:color w:val="000000"/>
+          <w:sz w:val="20"/>
+          <w:szCs w:val="20"/>
+        </w:rPr>
+        <w:t xml:space="preserve">, 포함된 분석의 </w:t>
+      </w:r>
+      <w:r>
+        <w:rPr>
+          <w:rFonts w:ascii="Malgun Gothic" w:cs="Malgun Gothic" w:eastAsia="Malgun Gothic" w:hAnsi="Malgun Gothic"/>
+          <w:b/>
+          <w:bCs/>
+          <w:color w:val="000000"/>
+          <w:sz w:val="20"/>
+          <w:szCs w:val="20"/>
+        </w:rPr>
+        <w:t xml:space="preserve">preprint·book-chapter판</w:t>
+      </w:r>
+      <w:r>
+        <w:rPr>
+          <w:rFonts w:ascii="Malgun Gothic" w:cs="Malgun Gothic" w:eastAsia="Malgun Gothic" w:hAnsi="Malgun Gothic"/>
+          <w:b w:val="false"/>
+          <w:bCs w:val="false"/>
+          <w:color w:val="000000"/>
+          <w:sz w:val="20"/>
+          <w:szCs w:val="20"/>
+        </w:rPr>
+        <w:t xml:space="preserve">)은 리뷰에 새 정보를 더하지 않으므로 </w:t>
+      </w:r>
+      <w:r>
+        <w:rPr>
+          <w:rFonts w:ascii="Malgun Gothic" w:cs="Malgun Gothic" w:eastAsia="Malgun Gothic" w:hAnsi="Malgun Gothic"/>
+          <w:b/>
+          <w:bCs/>
+          <w:color w:val="000000"/>
+          <w:sz w:val="20"/>
+          <w:szCs w:val="20"/>
+        </w:rPr>
+        <w:t xml:space="preserve">제외</w:t>
+      </w:r>
+      <w:r>
+        <w:rPr>
+          <w:rFonts w:ascii="Malgun Gothic" w:cs="Malgun Gothic" w:eastAsia="Malgun Gothic" w:hAnsi="Malgun Gothic"/>
+          <w:b w:val="false"/>
+          <w:bCs w:val="false"/>
+          <w:color w:val="000000"/>
+          <w:sz w:val="20"/>
+          <w:szCs w:val="20"/>
+        </w:rPr>
+        <w:t xml:space="preserve">(중복 55편 중 51편이 연례 통계 시리즈 이전판, 4편이 preprint·book-chapter 중복); ③ 반면 </w:t>
+      </w:r>
+      <w:r>
+        <w:rPr>
+          <w:rFonts w:ascii="Malgun Gothic" w:cs="Malgun Gothic" w:eastAsia="Malgun Gothic" w:hAnsi="Malgun Gothic"/>
+          <w:b/>
+          <w:bCs/>
+          <w:color w:val="000000"/>
+          <w:sz w:val="20"/>
+          <w:szCs w:val="20"/>
+        </w:rPr>
+        <w:t xml:space="preserve">시리즈의 최신 적격판</w:t>
+      </w:r>
+      <w:r>
+        <w:rPr>
+          <w:rFonts w:ascii="Malgun Gothic" w:cs="Malgun Gothic" w:eastAsia="Malgun Gothic" w:hAnsi="Malgun Gothic"/>
+          <w:b w:val="false"/>
+          <w:bCs w:val="false"/>
+          <w:color w:val="000000"/>
+          <w:sz w:val="20"/>
+          <w:szCs w:val="20"/>
+        </w:rPr>
+        <w:t xml:space="preserve">은 그 시리즈의 현재 서술을 담은 유일한 판이므로 리뷰에는 포함하되, 해당 registry·기간의 발생률은 전담 primary 연구가 이미 제공하므로 </w:t>
+      </w:r>
+      <w:r>
+        <w:rPr>
+          <w:rFonts w:ascii="Malgun Gothic" w:cs="Malgun Gothic" w:eastAsia="Malgun Gothic" w:hAnsi="Malgun Gothic"/>
+          <w:b/>
+          <w:bCs/>
+          <w:color w:val="000000"/>
+          <w:sz w:val="20"/>
+          <w:szCs w:val="20"/>
+        </w:rPr>
+        <w:t xml:space="preserve">서술적 종합에만 기여</w:t>
+      </w:r>
+      <w:r>
+        <w:rPr>
+          <w:rFonts w:ascii="Malgun Gothic" w:cs="Malgun Gothic" w:eastAsia="Malgun Gothic" w:hAnsi="Malgun Gothic"/>
+          <w:b w:val="false"/>
+          <w:bCs w:val="false"/>
+          <w:color w:val="000000"/>
+          <w:sz w:val="20"/>
+          <w:szCs w:val="20"/>
+        </w:rPr>
+        <w:t xml:space="preserve">; ④ 같은 registry family라도 기간·지역·subset이 다르면 별개 추정치로 보아 </w:t>
+      </w:r>
+      <w:r>
+        <w:rPr>
+          <w:rFonts w:ascii="Malgun Gothic" w:cs="Malgun Gothic" w:eastAsia="Malgun Gothic" w:hAnsi="Malgun Gothic"/>
+          <w:b/>
+          <w:bCs/>
+          <w:color w:val="000000"/>
+          <w:sz w:val="20"/>
+          <w:szCs w:val="20"/>
+        </w:rPr>
+        <w:t xml:space="preserve">민감도 overlap으로 유지</w:t>
+      </w:r>
+      <w:r>
+        <w:rPr>
+          <w:rFonts w:ascii="Malgun Gothic" w:cs="Malgun Gothic" w:eastAsia="Malgun Gothic" w:hAnsi="Malgun Gothic"/>
+          <w:b w:val="false"/>
+          <w:bCs w:val="false"/>
+          <w:color w:val="000000"/>
+          <w:sz w:val="20"/>
+          <w:szCs w:val="20"/>
+        </w:rPr>
+        <w:t xml:space="preserve">. 이로써 Giaquinto 2024(rec 0)와 Saka 2025(rec 4294)가 narrative에 남는 근거와, 같은 시리즈 이전판들이 제외된 근거가 하나의 기준으로 설명됨. 참고로 제외된 83편 중 51편이 연례 통계 시리즈의 </w:t>
+      </w:r>
+      <w:r>
+        <w:rPr>
+          <w:rFonts w:ascii="Malgun Gothic" w:cs="Malgun Gothic" w:eastAsia="Malgun Gothic" w:hAnsi="Malgun Gothic"/>
+          <w:b/>
+          <w:bCs/>
+          <w:color w:val="000000"/>
+          <w:sz w:val="20"/>
+          <w:szCs w:val="20"/>
+        </w:rPr>
+        <w:t xml:space="preserve">이전 연도판</w:t>
+      </w:r>
+      <w:r>
+        <w:rPr>
+          <w:rFonts w:ascii="Malgun Gothic" w:cs="Malgun Gothic" w:eastAsia="Malgun Gothic" w:hAnsi="Malgun Gothic"/>
+          <w:b w:val="false"/>
+          <w:bCs w:val="false"/>
+          <w:color w:val="000000"/>
+          <w:sz w:val="20"/>
+          <w:szCs w:val="20"/>
+        </w:rPr>
+        <w:t xml:space="preserve">(Breast cancer statistics 2015·2019, Cancer statistics for African Americans 2016·2022, Annual Report to the Nation 1973–1999 ~ 1975–2014 등)임을 확인. 즉 실제로는 "</w:t>
+      </w:r>
+      <w:r>
+        <w:rPr>
+          <w:rFonts w:ascii="Malgun Gothic" w:cs="Malgun Gothic" w:eastAsia="Malgun Gothic" w:hAnsi="Malgun Gothic"/>
+          <w:b/>
+          <w:bCs/>
+          <w:color w:val="000000"/>
+          <w:sz w:val="20"/>
+          <w:szCs w:val="20"/>
+        </w:rPr>
+        <w:t xml:space="preserve">시리즈별로 최신 적격판 1편만 남기고 이전 판은 중복으로 제외</w:t>
+      </w:r>
+      <w:r>
+        <w:rPr>
+          <w:rFonts w:ascii="Malgun Gothic" w:cs="Malgun Gothic" w:eastAsia="Malgun Gothic" w:hAnsi="Malgun Gothic"/>
+          <w:b w:val="false"/>
+          <w:bCs w:val="false"/>
+          <w:color w:val="000000"/>
+          <w:sz w:val="20"/>
+          <w:szCs w:val="20"/>
+        </w:rPr>
+        <w:t xml:space="preserve">"하는 규칙이 적용되고 있었으나 Methods에 서술되지 않아 지적된 불일치가 발생. Methods 적격기준에 해당 규칙과, </w:t>
+      </w:r>
+      <w:r>
+        <w:rPr>
+          <w:rFonts w:ascii="Malgun Gothic" w:cs="Malgun Gothic" w:eastAsia="Malgun Gothic" w:hAnsi="Malgun Gothic"/>
+          <w:b/>
+          <w:bCs/>
+          <w:color w:val="000000"/>
+          <w:sz w:val="20"/>
+          <w:szCs w:val="20"/>
+        </w:rPr>
+        <w:t xml:space="preserve">남긴 최신판은 해당 registry·기간의 발생률을 전담 primary 연구가 이미 제공하므로 대표값 후보로 쓰지 않고 서술적 종합에만 기여</w:t>
+      </w:r>
+      <w:r>
+        <w:rPr>
+          <w:rFonts w:ascii="Malgun Gothic" w:cs="Malgun Gothic" w:eastAsia="Malgun Gothic" w:hAnsi="Malgun Gothic"/>
+          <w:b w:val="false"/>
+          <w:bCs w:val="false"/>
+          <w:color w:val="000000"/>
+          <w:sz w:val="20"/>
+          <w:szCs w:val="20"/>
+        </w:rPr>
+        <w:t xml:space="preserve">한다는 점을 명시. 이로써 Giaquinto 2024(rec 0, Breast cancer statistics 2024)와 Saka 2025(rec 4294, Cancer statistics for African American and Black people 2025)가 같은 사유로 narrative에 남는 근거가 드러남.</w:t>
       </w:r>
     </w:p>
     <w:p>
@@ -1458,40 +1458,40 @@
           <w:sz w:val="20"/>
           <w:szCs w:val="20"/>
         </w:rPr>
-        <w:t xml:space="preserve">제외된 cell 전부 제시</w:t>
-      </w:r>
-      <w:r>
-        <w:rPr>
-          <w:rFonts w:ascii="Malgun Gothic" w:cs="Malgun Gothic" w:eastAsia="Malgun Gothic" w:hAnsi="Malgun Gothic"/>
-          <w:b w:val="false"/>
-          <w:bCs w:val="false"/>
-          <w:color w:val="000000"/>
-          <w:sz w:val="20"/>
-          <w:szCs w:val="20"/>
-        </w:rPr>
-        <w:t xml:space="preserve">: Table 6b만 changed 셀만 싣고 dropped를 생략하고 있었음(6a·6c·6d는 이미 changed·dropped 모두 제시). 6b도 dropped를 모두 포함하도록 수정해 </w:t>
-      </w:r>
-      <w:r>
-        <w:rPr>
-          <w:rFonts w:ascii="Malgun Gothic" w:cs="Malgun Gothic" w:eastAsia="Malgun Gothic" w:hAnsi="Malgun Gothic"/>
-          <w:b/>
-          <w:bCs/>
-          <w:color w:val="000000"/>
-          <w:sz w:val="20"/>
-          <w:szCs w:val="20"/>
-        </w:rPr>
-        <w:t xml:space="preserve">네 표 모두 changed·dropped 전 cell을 제시</w:t>
-      </w:r>
-      <w:r>
-        <w:rPr>
-          <w:rFonts w:ascii="Malgun Gothic" w:cs="Malgun Gothic" w:eastAsia="Malgun Gothic" w:hAnsi="Malgun Gothic"/>
-          <w:b w:val="false"/>
-          <w:bCs w:val="false"/>
-          <w:color w:val="000000"/>
-          <w:sz w:val="20"/>
-          <w:szCs w:val="20"/>
-        </w:rPr>
-        <w:t xml:space="preserve">(보충표 행 수 624 → 669).</w:t>
+        <w:t xml:space="preserve">Li 2025 분류 사유 수정</w:t>
+      </w:r>
+      <w:r>
+        <w:rPr>
+          <w:rFonts w:ascii="Malgun Gothic" w:cs="Malgun Gothic" w:eastAsia="Malgun Gothic" w:hAnsi="Malgun Gothic"/>
+          <w:b w:val="false"/>
+          <w:bCs w:val="false"/>
+          <w:color w:val="000000"/>
+          <w:sz w:val="20"/>
+          <w:szCs w:val="20"/>
+        </w:rPr>
+        <w:t xml:space="preserve">: 해당 연구는 rec 46(JAMA Netw Open 2025, SEER 22개 레지스트리 2010–2019, joinpoint 연간변화율 분석)으로 확인. 종전 표기 "single poolable estimate가 아님"은 pooling을 하지 않는 현재 분석 방식과 맞지 않으므로, 실제 사유인 </w:t>
+      </w:r>
+      <w:r>
+        <w:rPr>
+          <w:rFonts w:ascii="Malgun Gothic" w:cs="Malgun Gothic" w:eastAsia="Malgun Gothic" w:hAnsi="Malgun Gothic"/>
+          <w:b/>
+          <w:bCs/>
+          <w:color w:val="000000"/>
+          <w:sz w:val="20"/>
+          <w:szCs w:val="20"/>
+        </w:rPr>
+        <w:t xml:space="preserve">"연간 추세(annual percentage change)로만 보고해 단면 연령표준화율·비율을 추출할 수 없음"</w:t>
+      </w:r>
+      <w:r>
+        <w:rPr>
+          <w:rFonts w:ascii="Malgun Gothic" w:cs="Malgun Gothic" w:eastAsia="Malgun Gothic" w:hAnsi="Malgun Gothic"/>
+          <w:b w:val="false"/>
+          <w:bCs w:val="false"/>
+          <w:color w:val="000000"/>
+          <w:sz w:val="20"/>
+          <w:szCs w:val="20"/>
+        </w:rPr>
+        <w:t xml:space="preserve">으로 교체.</w:t>
       </w:r>
     </w:p>
     <w:p>
@@ -1512,40 +1512,62 @@
           <w:sz w:val="20"/>
           <w:szCs w:val="20"/>
         </w:rPr>
-        <w:t xml:space="preserve">변경 전후 출처 연구 표시</w:t>
-      </w:r>
-      <w:r>
-        <w:rPr>
-          <w:rFonts w:ascii="Malgun Gothic" w:cs="Malgun Gothic" w:eastAsia="Malgun Gothic" w:hAnsi="Malgun Gothic"/>
-          <w:b w:val="false"/>
-          <w:bCs w:val="false"/>
-          <w:color w:val="000000"/>
-          <w:sz w:val="20"/>
-          <w:szCs w:val="20"/>
-        </w:rPr>
-        <w:t xml:space="preserve">: 네 표의 값 컬럼에 해당 추정치를 공급한 연구를 병기하도록 변경 — "Main analysis: IRR [95% CI] — study"와 "Under restriction: IRR [95% CI] — study". 따라서 changed 셀에서는 </w:t>
-      </w:r>
-      <w:r>
-        <w:rPr>
-          <w:rFonts w:ascii="Malgun Gothic" w:cs="Malgun Gothic" w:eastAsia="Malgun Gothic" w:hAnsi="Malgun Gothic"/>
-          <w:b/>
-          <w:bCs/>
-          <w:color w:val="000000"/>
-          <w:sz w:val="20"/>
-          <w:szCs w:val="20"/>
-        </w:rPr>
-        <w:t xml:space="preserve">교체된 연구와 교체한 연구가 한 행에서 함께</w:t>
-      </w:r>
-      <w:r>
-        <w:rPr>
-          <w:rFonts w:ascii="Malgun Gothic" w:cs="Malgun Gothic" w:eastAsia="Malgun Gothic" w:hAnsi="Malgun Gothic"/>
-          <w:b w:val="false"/>
-          <w:bCs w:val="false"/>
-          <w:color w:val="000000"/>
-          <w:sz w:val="20"/>
-          <w:szCs w:val="20"/>
-        </w:rPr>
-        <w:t xml:space="preserve"> 보이고(예: Japanese 아형 셀에서 Gomez 2026 → Jin 2016), dropped 셀은 "not available under this restriction"으로 표시.</w:t>
+        <w:t xml:space="preserve">Supplementary Table 2의 narrative 사유 전면 실제화</w:t>
+      </w:r>
+      <w:r>
+        <w:rPr>
+          <w:rFonts w:ascii="Malgun Gothic" w:cs="Malgun Gothic" w:eastAsia="Malgun Gothic" w:hAnsi="Malgun Gothic"/>
+          <w:b w:val="false"/>
+          <w:bCs w:val="false"/>
+          <w:color w:val="000000"/>
+          <w:sz w:val="20"/>
+          <w:szCs w:val="20"/>
+        </w:rPr>
+        <w:t xml:space="preserve">: 점검 결과 narrative 118편 중 </w:t>
+      </w:r>
+      <w:r>
+        <w:rPr>
+          <w:rFonts w:ascii="Malgun Gothic" w:cs="Malgun Gothic" w:eastAsia="Malgun Gothic" w:hAnsi="Malgun Gothic"/>
+          <w:b/>
+          <w:bCs/>
+          <w:color w:val="000000"/>
+          <w:sz w:val="20"/>
+          <w:szCs w:val="20"/>
+        </w:rPr>
+        <w:t xml:space="preserve">103편이 "No recoverable NHW comparison" 한 문구로 일괄 표시</w:t>
+      </w:r>
+      <w:r>
+        <w:rPr>
+          <w:rFonts w:ascii="Malgun Gothic" w:cs="Malgun Gothic" w:eastAsia="Malgun Gothic" w:hAnsi="Malgun Gothic"/>
+          <w:b w:val="false"/>
+          <w:bCs w:val="false"/>
+          <w:color w:val="000000"/>
+          <w:sz w:val="20"/>
+          <w:szCs w:val="20"/>
+        </w:rPr>
+        <w:t xml:space="preserve">되고 있었음(개별 사유 부여는 15편). 실제 사유는 시리즈 재보고 9, 추세만 28, 사회경제적 비교 6, 비미국 비교군 5, 비율 아님(PIR 등) 5, 그림 전용 4 등으로 다양하므로, 적격성 기록에 사유가 있는 경우 그 사유를 유형별 문구로 표시하도록 수정 → </w:t>
+      </w:r>
+      <w:r>
+        <w:rPr>
+          <w:rFonts w:ascii="Malgun Gothic" w:cs="Malgun Gothic" w:eastAsia="Malgun Gothic" w:hAnsi="Malgun Gothic"/>
+          <w:b/>
+          <w:bCs/>
+          <w:color w:val="000000"/>
+          <w:sz w:val="20"/>
+          <w:szCs w:val="20"/>
+        </w:rPr>
+        <w:t xml:space="preserve">개별 사유 표시가 15편에서 57편으로 확대</w:t>
+      </w:r>
+      <w:r>
+        <w:rPr>
+          <w:rFonts w:ascii="Malgun Gothic" w:cs="Malgun Gothic" w:eastAsia="Malgun Gothic" w:hAnsi="Malgun Gothic"/>
+          <w:b w:val="false"/>
+          <w:bCs w:val="false"/>
+          <w:color w:val="000000"/>
+          <w:sz w:val="20"/>
+          <w:szCs w:val="20"/>
+        </w:rPr>
+        <w:t xml:space="preserve">. 사유 기록이 없는 나머지는 포괄 사유("NHW 기준 연령표준화율·비율을 복구할 수 없음")로 표시하고, 어떤 경우에 개별 사유가 표시되고 어떤 경우에 포괄 사유가 표시되는지를 Supplementary Table 2 Note에 명시.</w:t>
       </w:r>
     </w:p>
     <w:p>
@@ -1566,62 +1588,40 @@
           <w:sz w:val="20"/>
           <w:szCs w:val="20"/>
         </w:rPr>
-        <w:t xml:space="preserve">dropped cell 해석 주의 명시</w:t>
-      </w:r>
-      <w:r>
-        <w:rPr>
-          <w:rFonts w:ascii="Malgun Gothic" w:cs="Malgun Gothic" w:eastAsia="Malgun Gothic" w:hAnsi="Malgun Gothic"/>
-          <w:b w:val="false"/>
-          <w:bCs w:val="false"/>
-          <w:color w:val="000000"/>
-          <w:sz w:val="20"/>
-          <w:szCs w:val="20"/>
-        </w:rPr>
-        <w:t xml:space="preserve">: 제한을 충족하지 못해 제외된 cell을 견고성 확인으로 읽지 않도록, Supplementary Table 6 Note에 "dropped cell은 그 제한 하에서 </w:t>
-      </w:r>
-      <w:r>
-        <w:rPr>
-          <w:rFonts w:ascii="Malgun Gothic" w:cs="Malgun Gothic" w:eastAsia="Malgun Gothic" w:hAnsi="Malgun Gothic"/>
-          <w:b/>
-          <w:bCs/>
-          <w:color w:val="000000"/>
-          <w:sz w:val="20"/>
-          <w:szCs w:val="20"/>
-        </w:rPr>
-        <w:t xml:space="preserve">검증되지 않은(untested)</w:t>
-      </w:r>
-      <w:r>
-        <w:rPr>
-          <w:rFonts w:ascii="Malgun Gothic" w:cs="Malgun Gothic" w:eastAsia="Malgun Gothic" w:hAnsi="Malgun Gothic"/>
-          <w:b w:val="false"/>
-          <w:bCs w:val="false"/>
-          <w:color w:val="000000"/>
-          <w:sz w:val="20"/>
-          <w:szCs w:val="20"/>
-        </w:rPr>
-        <w:t xml:space="preserve"> 것이며 확인된 것이 아니다"를 명시. Discussion의 민감도 서술도 "대부분의 차이가 불일치가 아니라 자격 미충족에 따른 drop"이라는 안심형 표현을 걷어내고, </w:t>
-      </w:r>
-      <w:r>
-        <w:rPr>
-          <w:rFonts w:ascii="Malgun Gothic" w:cs="Malgun Gothic" w:eastAsia="Malgun Gothic" w:hAnsi="Malgun Gothic"/>
-          <w:b/>
-          <w:bCs/>
-          <w:color w:val="000000"/>
-          <w:sz w:val="20"/>
-          <w:szCs w:val="20"/>
-        </w:rPr>
-        <w:t xml:space="preserve">각 제한이 재검토할 수 있었던 cell에 한해 패턴이 유지되었으며 directly-reported 제한만으로도 85개 중 46개 cell이 미검토로 남는다</w:t>
-      </w:r>
-      <w:r>
-        <w:rPr>
-          <w:rFonts w:ascii="Malgun Gothic" w:cs="Malgun Gothic" w:eastAsia="Malgun Gothic" w:hAnsi="Malgun Gothic"/>
-          <w:b w:val="false"/>
-          <w:bCs w:val="false"/>
-          <w:color w:val="000000"/>
-          <w:sz w:val="20"/>
-          <w:szCs w:val="20"/>
-        </w:rPr>
-        <w:t xml:space="preserve">는 사실을 함께 기술.</w:t>
+        <w:t xml:space="preserve">대표값 선정 단위 표기 통일</w:t>
+      </w:r>
+      <w:r>
+        <w:rPr>
+          <w:rFonts w:ascii="Malgun Gothic" w:cs="Malgun Gothic" w:eastAsia="Malgun Gothic" w:hAnsi="Malgun Gothic"/>
+          <w:b w:val="false"/>
+          <w:bCs w:val="false"/>
+          <w:color w:val="000000"/>
+          <w:sz w:val="20"/>
+          <w:szCs w:val="20"/>
+        </w:rPr>
+        <w:t xml:space="preserve">: Introduction("one representative population-based estimate per registry family"), Table 1 Note("one per registry family"), 본문 표·그림 Note에 남아 있던 </w:t>
+      </w:r>
+      <w:r>
+        <w:rPr>
+          <w:rFonts w:ascii="Malgun Gothic" w:cs="Malgun Gothic" w:eastAsia="Malgun Gothic" w:hAnsi="Malgun Gothic"/>
+          <w:b/>
+          <w:bCs/>
+          <w:color w:val="000000"/>
+          <w:sz w:val="20"/>
+          <w:szCs w:val="20"/>
+        </w:rPr>
+        <w:t xml:space="preserve">"per registry family"를 Methods의 "per analytic cell"로 통일</w:t>
+      </w:r>
+      <w:r>
+        <w:rPr>
+          <w:rFonts w:ascii="Malgun Gothic" w:cs="Malgun Gothic" w:eastAsia="Malgun Gothic" w:hAnsi="Malgun Gothic"/>
+          <w:b w:val="false"/>
+          <w:bCs w:val="false"/>
+          <w:color w:val="000000"/>
+          <w:sz w:val="20"/>
+          <w:szCs w:val="20"/>
+        </w:rPr>
+        <w:t xml:space="preserve">. registry family는 셀 내부의 중복 판정 단위로만 쓰인다는 점을 작성 지침에도 반영.</w:t>
       </w:r>
     </w:p>
     <w:sectPr>

</xml_diff>

<commit_message>
Explain why the AI/AN representative changes under the low-RoB restriction
The substitution follows from how uncertainty was reported, not from a
difference in bias: the main-analysis representative (Melkonian 2019,
2010-2015, 0.87) carries no confidence interval on any of its seven
extracted rows, so it rates Q8=No and moderate and is excluded by the
restriction, while Wingo 2008 (1999-2004, 0.63) reports intervals on all
seven of its rows, rates low, and fills the cell from within the same
IHS-linked family. Discussion now states that mechanism before noting that
the gap between the two is the rise over time already described, and the
Feedback5 response records the same explanation.

Crosscheck A-H all pass.

Co-Authored-By: Claude Opus 5 <noreply@anthropic.com>
Claude-Session: https://claude.ai/code/session_01CuLT4FKRBtsU22Vwfjj2qn
</commit_message>
<xml_diff>
--- a/meta_agents/search_v2/outputs/Feedback5_Response.docx
+++ b/meta_agents/search_v2/outputs/Feedback5_Response.docx
@@ -1499,7 +1499,29 @@
           <w:sz w:val="20"/>
           <w:szCs w:val="20"/>
         </w:rPr>
-        <w:t xml:space="preserve">으로 교체됨. 이는 본문에서 이미 기술한 IHS-linked 추정치의 시간적 상승과 같은 방향이지 동일 기간에 대한 두 자료원의 불일치가 아니지만, 이 교체로 </w:t>
+        <w:t xml:space="preserve">으로 교체됨. 교체 기전은 </w:t>
+      </w:r>
+      <w:r>
+        <w:rPr>
+          <w:rFonts w:ascii="Malgun Gothic" w:cs="Malgun Gothic" w:eastAsia="Malgun Gothic" w:hAnsi="Malgun Gothic"/>
+          <w:b/>
+          <w:bCs/>
+          <w:color w:val="000000"/>
+          <w:sz w:val="20"/>
+          <w:szCs w:val="20"/>
+        </w:rPr>
+        <w:t xml:space="preserve">불확실성 보고 형식의 차이</w:t>
+      </w:r>
+      <w:r>
+        <w:rPr>
+          <w:rFonts w:ascii="Malgun Gothic" w:cs="Malgun Gothic" w:eastAsia="Malgun Gothic" w:hAnsi="Malgun Gothic"/>
+          <w:b w:val="false"/>
+          <w:bCs w:val="false"/>
+          <w:color w:val="000000"/>
+          <w:sz w:val="20"/>
+          <w:szCs w:val="20"/>
+        </w:rPr>
+        <w:t xml:space="preserve">로, 주분석 대표인 Melkonian 2019는 추출 7행 모두 신뢰구간이 없어(Q8=No) moderate로 분류되어 제한에서 빠지고, 구간을 모두 보고한 Wingo 2008(7/7행 CI, Low)이 같은 IHS 계열 내에서 그 자리를 채움. 이는 본문에서 이미 기술한 IHS-linked 추정치의 시간적 상승과 같은 방향이지 동일 기간에 대한 두 자료원의 불일치가 아니지만, 이 교체로 </w:t>
       </w:r>
       <w:r>
         <w:rPr>

</xml_diff>

<commit_message>
Record why the variance requirement stays in Q8
The response said the criterion was kept and applied consistently but not
why keeping it is defensible. Added the reasoning: a missing interval is
strictly a reporting gap rather than bias, and dropping it from Q8 was
considered, but without a variance a reader cannot check that the
standardization and weighting were appropriate or that the case count
supports a stable rate (which is what JBI Q8 asks), an estimate with no
interval reads as more definite than it is, and in small subgroup and
regional cells the instability stays hidden — the AI/AN regional estimates
(0.57-1.33) are reported mostly without intervals. Hence the criterion is
kept and applied consistently, with the meaning of the resulting rating
spelled out.

Co-Authored-By: Claude Opus 5 <noreply@anthropic.com>
Claude-Session: https://claude.ai/code/session_01CuLT4FKRBtsU22Vwfjj2qn
</commit_message>
<xml_diff>
--- a/meta_agents/search_v2/outputs/Feedback5_Response.docx
+++ b/meta_agents/search_v2/outputs/Feedback5_Response.docx
@@ -1370,6 +1370,60 @@
           <w:szCs w:val="20"/>
         </w:rPr>
         <w:t xml:space="preserve">하며, 추정치에 의존하는 항목(특히 Q8의 분산 요건)은 추출된 추정치를 기준으로 판정한다고 기술.</w:t>
+      </w:r>
+    </w:p>
+    <w:p>
+      <w:pPr>
+        <w:pStyle w:val="ListParagraph"/>
+        <w:numPr>
+          <w:ilvl w:val="0"/>
+          <w:numId w:val="1"/>
+        </w:numPr>
+        <w:spacing w:after="80" w:line="276"/>
+      </w:pPr>
+      <w:r>
+        <w:rPr>
+          <w:rFonts w:ascii="Malgun Gothic" w:cs="Malgun Gothic" w:eastAsia="Malgun Gothic" w:hAnsi="Malgun Gothic"/>
+          <w:b/>
+          <w:bCs/>
+          <w:color w:val="000000"/>
+          <w:sz w:val="20"/>
+          <w:szCs w:val="20"/>
+        </w:rPr>
+        <w:t xml:space="preserve">분산 요건을 Q8에 두는 근거</w:t>
+      </w:r>
+      <w:r>
+        <w:rPr>
+          <w:rFonts w:ascii="Malgun Gothic" w:cs="Malgun Gothic" w:eastAsia="Malgun Gothic" w:hAnsi="Malgun Gothic"/>
+          <w:b w:val="false"/>
+          <w:bCs w:val="false"/>
+          <w:color w:val="000000"/>
+          <w:sz w:val="20"/>
+          <w:szCs w:val="20"/>
+        </w:rPr>
+        <w:t xml:space="preserve">: 신뢰구간 미보고는 엄밀히 말해 비뚤림(추정치가 참값에서 체계적으로 벗어남)이 아니라 불확실성 보고의 결함이므로, 기준을 완화해 Q8에서 분리하는 선택지도 검토함. 그러나 ① 분산이 없으면 표준화와 가중이 적절했는지, 사례수가 안정적인 율을 낼 만한지 독자가 검증할 수 없어 JBI Q8(적절한 통계분석)의 취지에 직접 닿고, ② 불확실성이 제시되지 않으면 결과가 실제보다 확정적으로 보이며, ③ 특히 사례수가 적은 소수 집단·지역 셀에서는 구간이 넓을 수 있는데 점추정치만 제시되면 그 불안정성이 드러나지 않는다는 점(실제로 AI/AN 지역 추정치 0.57–1.33이 대부분 구간 없이 보고됨)을 고려해 </w:t>
+      </w:r>
+      <w:r>
+        <w:rPr>
+          <w:rFonts w:ascii="Malgun Gothic" w:cs="Malgun Gothic" w:eastAsia="Malgun Gothic" w:hAnsi="Malgun Gothic"/>
+          <w:b/>
+          <w:bCs/>
+          <w:color w:val="000000"/>
+          <w:sz w:val="20"/>
+          <w:szCs w:val="20"/>
+        </w:rPr>
+        <w:t xml:space="preserve">기준을 유지하고 일관 적용하는 쪽을 택함</w:t>
+      </w:r>
+      <w:r>
+        <w:rPr>
+          <w:rFonts w:ascii="Malgun Gothic" w:cs="Malgun Gothic" w:eastAsia="Malgun Gothic" w:hAnsi="Malgun Gothic"/>
+          <w:b w:val="false"/>
+          <w:bCs w:val="false"/>
+          <w:color w:val="000000"/>
+          <w:sz w:val="20"/>
+          <w:szCs w:val="20"/>
+        </w:rPr>
+        <w:t xml:space="preserve">. 대신 그 판정이 무엇을 뜻하는지는 아래와 같이 명시.</w:t>
       </w:r>
     </w:p>
     <w:p>

</xml_diff>

<commit_message>
Offer the variance-separation alternative to the supervisor, with its effects
Item 4 now presents, alongside the implemented decision, the alternative of
judging Q8 on standardization alone and recording variance/interval
reporting outside the RoB rating (provenance and the dagger marker already
track it). The measured effects are given so the choice can be made on
numbers: Q8=No would drop from 9 studies to 0, RoB would move from
41 Low / 17 Moderate to 49 Low / 9 Moderate, the low-RoB sensitivity from
54/19/12 to 63 unchanged / 14 changed / 8 dropped, and Melkonian 2019
returning to Low would remove the AI/AN aggregate substitution (0.87 ->
0.63) along with all nine affected AI/AN cells. The current version keeps
the variance requirement, and the response asks for direction.

Co-Authored-By: Claude Opus 5 <noreply@anthropic.com>
Claude-Session: https://claude.ai/code/session_01CuLT4FKRBtsU22Vwfjj2qn
</commit_message>
<xml_diff>
--- a/meta_agents/search_v2/outputs/Feedback5_Response.docx
+++ b/meta_agents/search_v2/outputs/Feedback5_Response.docx
@@ -1478,6 +1478,126 @@
           <w:szCs w:val="20"/>
         </w:rPr>
         <w:t xml:space="preserve">과, 그 때문에 비율을 구간 없이 보고한 대규모 레지스트리 분석 몇 편이 moderate로 분류된다는 점을 함께 명시.</w:t>
+      </w:r>
+    </w:p>
+    <w:p>
+      <w:pPr>
+        <w:pStyle w:val="ListParagraph"/>
+        <w:numPr>
+          <w:ilvl w:val="0"/>
+          <w:numId w:val="1"/>
+        </w:numPr>
+        <w:spacing w:after="80" w:line="276"/>
+      </w:pPr>
+      <w:r>
+        <w:rPr>
+          <w:rFonts w:ascii="Malgun Gothic" w:cs="Malgun Gothic" w:eastAsia="Malgun Gothic" w:hAnsi="Malgun Gothic"/>
+          <w:b/>
+          <w:bCs/>
+          <w:color w:val="000000"/>
+          <w:sz w:val="20"/>
+          <w:szCs w:val="20"/>
+        </w:rPr>
+        <w:t xml:space="preserve">대안 제시 — 분산 요건을 Q8에서 분리하는 방안(지시 요청)</w:t>
+      </w:r>
+      <w:r>
+        <w:rPr>
+          <w:rFonts w:ascii="Malgun Gothic" w:cs="Malgun Gothic" w:eastAsia="Malgun Gothic" w:hAnsi="Malgun Gothic"/>
+          <w:b w:val="false"/>
+          <w:bCs w:val="false"/>
+          <w:color w:val="000000"/>
+          <w:sz w:val="20"/>
+          <w:szCs w:val="20"/>
+        </w:rPr>
+        <w:t xml:space="preserve">: 위 근거로 현행(분산 요건 유지)을 기본으로 반영했으나, 신뢰구간 미보고가 엄밀히는 비뚤림이 아니라는 점을 더 중시한다면 </w:t>
+      </w:r>
+      <w:r>
+        <w:rPr>
+          <w:rFonts w:ascii="Malgun Gothic" w:cs="Malgun Gothic" w:eastAsia="Malgun Gothic" w:hAnsi="Malgun Gothic"/>
+          <w:b/>
+          <w:bCs/>
+          <w:color w:val="000000"/>
+          <w:sz w:val="20"/>
+          <w:szCs w:val="20"/>
+        </w:rPr>
+        <w:t xml:space="preserve">Q8은 "명시된 표준인구로의 적절한 연령표준화"만 판정하고, 분산·구간 보고 여부는 RoB 등급과 분리해 별도로 기록</w:t>
+      </w:r>
+      <w:r>
+        <w:rPr>
+          <w:rFonts w:ascii="Malgun Gothic" w:cs="Malgun Gothic" w:eastAsia="Malgun Gothic" w:hAnsi="Malgun Gothic"/>
+          <w:b w:val="false"/>
+          <w:bCs w:val="false"/>
+          <w:color w:val="000000"/>
+          <w:sz w:val="20"/>
+          <w:szCs w:val="20"/>
+        </w:rPr>
+        <w:t xml:space="preserve">하는 방식도 가능합니다(분산 출처는 이미 Table 1의 ‡ 표기와 provenance 열로 추적 중이므로 정보 손실은 없습니다). 이 경우 실제 영향을 계산해 보면 Q8=No 9편이 Yes로 바뀌어 </w:t>
+      </w:r>
+      <w:r>
+        <w:rPr>
+          <w:rFonts w:ascii="Malgun Gothic" w:cs="Malgun Gothic" w:eastAsia="Malgun Gothic" w:hAnsi="Malgun Gothic"/>
+          <w:b/>
+          <w:bCs/>
+          <w:color w:val="000000"/>
+          <w:sz w:val="20"/>
+          <w:szCs w:val="20"/>
+        </w:rPr>
+        <w:t xml:space="preserve">RoB가 Low 41·Moderate 17 → Low 49·Moderate 9</w:t>
+      </w:r>
+      <w:r>
+        <w:rPr>
+          <w:rFonts w:ascii="Malgun Gothic" w:cs="Malgun Gothic" w:eastAsia="Malgun Gothic" w:hAnsi="Malgun Gothic"/>
+          <w:b w:val="false"/>
+          <w:bCs w:val="false"/>
+          <w:color w:val="000000"/>
+          <w:sz w:val="20"/>
+          <w:szCs w:val="20"/>
+        </w:rPr>
+        <w:t xml:space="preserve">, 저위험 제한 민감도가 </w:t>
+      </w:r>
+      <w:r>
+        <w:rPr>
+          <w:rFonts w:ascii="Malgun Gothic" w:cs="Malgun Gothic" w:eastAsia="Malgun Gothic" w:hAnsi="Malgun Gothic"/>
+          <w:b/>
+          <w:bCs/>
+          <w:color w:val="000000"/>
+          <w:sz w:val="20"/>
+          <w:szCs w:val="20"/>
+        </w:rPr>
+        <w:t xml:space="preserve">54/19/12 → 63 unchanged·14 changed·8 dropped</w:t>
+      </w:r>
+      <w:r>
+        <w:rPr>
+          <w:rFonts w:ascii="Malgun Gothic" w:cs="Malgun Gothic" w:eastAsia="Malgun Gothic" w:hAnsi="Malgun Gothic"/>
+          <w:b w:val="false"/>
+          <w:bCs w:val="false"/>
+          <w:color w:val="000000"/>
+          <w:sz w:val="20"/>
+          <w:szCs w:val="20"/>
+        </w:rPr>
+        <w:t xml:space="preserve">가 되고, Melkonian 2019가 Low로 복귀하므로 </w:t>
+      </w:r>
+      <w:r>
+        <w:rPr>
+          <w:rFonts w:ascii="Malgun Gothic" w:cs="Malgun Gothic" w:eastAsia="Malgun Gothic" w:hAnsi="Malgun Gothic"/>
+          <w:b/>
+          <w:bCs/>
+          <w:color w:val="000000"/>
+          <w:sz w:val="20"/>
+          <w:szCs w:val="20"/>
+        </w:rPr>
+        <w:t xml:space="preserve">AI/AN aggregate의 0.87 → 0.63 교체와 AI/AN 관련 9개 cell의 변경·탈락이 모두 사라집니다</w:t>
+      </w:r>
+      <w:r>
+        <w:rPr>
+          <w:rFonts w:ascii="Malgun Gothic" w:cs="Malgun Gothic" w:eastAsia="Malgun Gothic" w:hAnsi="Malgun Gothic"/>
+          <w:b w:val="false"/>
+          <w:bCs w:val="false"/>
+          <w:color w:val="000000"/>
+          <w:sz w:val="20"/>
+          <w:szCs w:val="20"/>
+        </w:rPr>
+        <w:t xml:space="preserve">. 두 방식 모두 내부적으로 일관되며 어느 쪽이든 그에 맞춰 RoB 표·민감도·본문 서술을 함께 갱신할 수 있으므로, 비뚤림 위험 평가에 불확실성 보고를 포함할지에 대한 지시를 주시면 반영하겠습니다.</w:t>
       </w:r>
     </w:p>
     <w:p>

</xml_diff>

<commit_message>
Spell out which RoB items are judged at study level and which at estimate level
The unit of appraisal was stated but left as "items that depend on the
estimate", which does not tell the reader which items those are. Methods,
the Table 5 note and the Feedback5 response now make the split explicit:
items 1-7 describe the study and its registry (sample frame, ascertainment,
case numbers, description, coverage, case identification, race/ethnicity
measurement) and are judged at that level regardless of which estimates
were extracted, while item 8 depends on the estimates and is judged on
those extracted for this review.

Crosscheck A-H all pass.

Co-Authored-By: Claude Opus 5 <noreply@anthropic.com>
Claude-Session: https://claude.ai/code/session_01CuLT4FKRBtsU22Vwfjj2qn
</commit_message>
<xml_diff>
--- a/meta_agents/search_v2/outputs/Feedback5_Response.docx
+++ b/meta_agents/search_v2/outputs/Feedback5_Response.docx
@@ -1347,7 +1347,7 @@
           <w:sz w:val="20"/>
           <w:szCs w:val="20"/>
         </w:rPr>
-        <w:t xml:space="preserve">: "연구 전체와 추출한 추정치 중 무엇을 평가했는지"를 Methods와 Supplementary Table 5 Note에 명시 — </w:t>
+        <w:t xml:space="preserve">: "연구 전체와 추출한 추정치 중 무엇을 평가했는지"를 Methods와 Supplementary Table 5 Note에 명시. </w:t>
       </w:r>
       <w:r>
         <w:rPr>
@@ -1369,7 +1369,51 @@
           <w:sz w:val="20"/>
           <w:szCs w:val="20"/>
         </w:rPr>
-        <w:t xml:space="preserve">하며, 추정치에 의존하는 항목(특히 Q8의 분산 요건)은 추출된 추정치를 기준으로 판정한다고 기술.</w:t>
+        <w:t xml:space="preserve">하며, 항목별 판정 수준을 구분해 기술 — </w:t>
+      </w:r>
+      <w:r>
+        <w:rPr>
+          <w:rFonts w:ascii="Malgun Gothic" w:cs="Malgun Gothic" w:eastAsia="Malgun Gothic" w:hAnsi="Malgun Gothic"/>
+          <w:b/>
+          <w:bCs/>
+          <w:color w:val="000000"/>
+          <w:sz w:val="20"/>
+          <w:szCs w:val="20"/>
+        </w:rPr>
+        <w:t xml:space="preserve">Q1–Q7은 연구·레지스트리 수준 특성</w:t>
+      </w:r>
+      <w:r>
+        <w:rPr>
+          <w:rFonts w:ascii="Malgun Gothic" w:cs="Malgun Gothic" w:eastAsia="Malgun Gothic" w:hAnsi="Malgun Gothic"/>
+          <w:b w:val="false"/>
+          <w:bCs w:val="false"/>
+          <w:color w:val="000000"/>
+          <w:sz w:val="20"/>
+          <w:szCs w:val="20"/>
+        </w:rPr>
+        <w:t xml:space="preserve">(표집 프레임, 사례 확인, 사례수, 세팅·인구 기술, 커버리지, 침습성 유방암 확인, 인종·민족 측정 방식)이므로 어떤 추정치를 추출했는지와 무관하게 판정되고, </w:t>
+      </w:r>
+      <w:r>
+        <w:rPr>
+          <w:rFonts w:ascii="Malgun Gothic" w:cs="Malgun Gothic" w:eastAsia="Malgun Gothic" w:hAnsi="Malgun Gothic"/>
+          <w:b/>
+          <w:bCs/>
+          <w:color w:val="000000"/>
+          <w:sz w:val="20"/>
+          <w:szCs w:val="20"/>
+        </w:rPr>
+        <w:t xml:space="preserve">Q8만 추정치 자체에 의존</w:t>
+      </w:r>
+      <w:r>
+        <w:rPr>
+          <w:rFonts w:ascii="Malgun Gothic" w:cs="Malgun Gothic" w:eastAsia="Malgun Gothic" w:hAnsi="Malgun Gothic"/>
+          <w:b w:val="false"/>
+          <w:bCs w:val="false"/>
+          <w:color w:val="000000"/>
+          <w:sz w:val="20"/>
+          <w:szCs w:val="20"/>
+        </w:rPr>
+        <w:t xml:space="preserve">하므로 이 리뷰가 추출한 추정치를 기준으로 판정(원문이 구간을 인쇄했거나 원문 정보로 복구 가능하면 분산 있음으로 계산).</w:t>
       </w:r>
     </w:p>
     <w:p>

</xml_diff>

<commit_message>
Discussion: state PRCDA population coverage in the AI/AN passage
The AI/AN passage already separated the three differences behind the
0.56 versus 0.87 gap (diagnosis period, PRCDA county restriction applied
to the NHW comparison group as well, and race ascertainment), but it did
not say how much of the AI/AN population the PRCDA restriction covers.

Add the coverage figures from the source: PRCDA counties contain or
adjoin federally recognized tribal lands and hold about 53% of the US
AI/AN population, with regional coverage from 16% in the East to all of
Alaska, so the IHS-linked figures describe about half of this population
rather than the whole of it, and the better-covered regions are those
where AI/AN residents are a larger share of the county population.

Record the addition and the source quotations under item 6 of the
fifth-round feedback response.

Co-Authored-By: Claude Opus 5 <noreply@anthropic.com>
Claude-Session: https://claude.ai/code/session_01CuLT4FKRBtsU22Vwfjj2qn
</commit_message>
<xml_diff>
--- a/meta_agents/search_v2/outputs/Feedback5_Response.docx
+++ b/meta_agents/search_v2/outputs/Feedback5_Response.docx
@@ -2513,7 +2513,29 @@
           <w:sz w:val="20"/>
           <w:szCs w:val="20"/>
         </w:rPr>
-        <w:t xml:space="preserve">되므로 분자·분모가 모두 전국 인구와 다른 집단을 기술. ③ </w:t>
+        <w:t xml:space="preserve">되므로 분자·분모가 모두 전국 인구와 다른 집단을 기술. 나아가 </w:t>
+      </w:r>
+      <w:r>
+        <w:rPr>
+          <w:rFonts w:ascii="Malgun Gothic" w:cs="Malgun Gothic" w:eastAsia="Malgun Gothic" w:hAnsi="Malgun Gothic"/>
+          <w:b/>
+          <w:bCs/>
+          <w:color w:val="000000"/>
+          <w:sz w:val="20"/>
+          <w:szCs w:val="20"/>
+        </w:rPr>
+        <w:t xml:space="preserve">PRCDA가 AI/AN 인구를 어느 정도 포함하는지(대표성 범위)</w:t>
+      </w:r>
+      <w:r>
+        <w:rPr>
+          <w:rFonts w:ascii="Malgun Gothic" w:cs="Malgun Gothic" w:eastAsia="Malgun Gothic" w:hAnsi="Malgun Gothic"/>
+          <w:b w:val="false"/>
+          <w:bCs w:val="false"/>
+          <w:color w:val="000000"/>
+          <w:sz w:val="20"/>
+          <w:szCs w:val="20"/>
+        </w:rPr>
+        <w:t xml:space="preserve">도 함께 명시 — 원문에서 "PRCDA counties … contain or are located adjacent to federally recognized tribal lands … Approximately 53% of the U.S. AI/AN population resides in PRCDA counties"와 표 각주의 지역별 커버리지(East 16.4% ~ Alaska 100%, 전국 53.0%)를 확인해, IHS-linked 값이 AI/AN 인구의 약 절반을 기술하며 커버리지가 높은 지역일수록 카운티 내 AI/AN 인구 비중이 큰 지역이라는 점을 Discussion에 기술. 따라서 이 값은 전국 AI/AN 인구 전체의 추정치로 읽히지 않도록 함. ③ </w:t>
       </w:r>
       <w:r>
         <w:rPr>

</xml_diff>

<commit_message>
Discussion: correct what the 38 versus 47 cell split counts
The contribution paragraph reported the split as cells supported by more
than one source "each from a different registry family" (38) against
cells resting on a single study (47). Recomputing from the ledger over
the 85 analytic cells shows 38/47 is the two-or-more-studies against
one-study split; the stricter two-or-more-registry-families condition
holds in 27 of those 38, the other 11 being several studies within one
family.

Report both figures: 38 cells that more than one study could fill, 27 of
them drawing on at least two different registry families, against 47
resting on a single study. The caution that nested US registries leave
even different families partly dependent is unchanged.

Co-Authored-By: Claude Opus 5 <noreply@anthropic.com>
Claude-Session: https://claude.ai/code/session_01CuLT4FKRBtsU22Vwfjj2qn
</commit_message>
<xml_diff>
--- a/meta_agents/search_v2/outputs/Feedback5_Response.docx
+++ b/meta_agents/search_v2/outputs/Feedback5_Response.docx
@@ -2349,7 +2349,117 @@
           <w:sz w:val="20"/>
           <w:szCs w:val="20"/>
         </w:rPr>
-        <w:t xml:space="preserve">는 단서를 명시. 38 vs 47이라는 구분 자체는 유지하되 그 근거를 "독립성"이 아니라 "자료원 수"로 재정의. Results의 narrative 서술에 있던 "no </w:t>
+        <w:t xml:space="preserve">는 단서를 명시. 38 vs 47이라는 구분 자체는 유지하되 그 근거를 "독립성"이 아니라 "자료원 수"로 재정의. </w:t>
+      </w:r>
+      <w:r>
+        <w:rPr>
+          <w:rFonts w:ascii="Malgun Gothic" w:cs="Malgun Gothic" w:eastAsia="Malgun Gothic" w:hAnsi="Malgun Gothic"/>
+          <w:b/>
+          <w:bCs/>
+          <w:color w:val="000000"/>
+          <w:sz w:val="20"/>
+          <w:szCs w:val="20"/>
+        </w:rPr>
+        <w:t xml:space="preserve">다만 이 교체 과정에서 수치-문구 불일치가 발생했음을 재점검에서 확인하고 정정</w:t>
+      </w:r>
+      <w:r>
+        <w:rPr>
+          <w:rFonts w:ascii="Malgun Gothic" w:cs="Malgun Gothic" w:eastAsia="Malgun Gothic" w:hAnsi="Malgun Gothic"/>
+          <w:b w:val="false"/>
+          <w:bCs w:val="false"/>
+          <w:color w:val="000000"/>
+          <w:sz w:val="20"/>
+          <w:szCs w:val="20"/>
+        </w:rPr>
+        <w:t xml:space="preserve"> — 38/47은 85개 cell 중 </w:t>
+      </w:r>
+      <w:r>
+        <w:rPr>
+          <w:rFonts w:ascii="Malgun Gothic" w:cs="Malgun Gothic" w:eastAsia="Malgun Gothic" w:hAnsi="Malgun Gothic"/>
+          <w:b/>
+          <w:bCs/>
+          <w:color w:val="000000"/>
+          <w:sz w:val="20"/>
+          <w:szCs w:val="20"/>
+        </w:rPr>
+        <w:t xml:space="preserve">추출 가능한 추정치를 2편 이상 가진 cell(38) 대 1편뿐인 cell(47)</w:t>
+      </w:r>
+      <w:r>
+        <w:rPr>
+          <w:rFonts w:ascii="Malgun Gothic" w:cs="Malgun Gothic" w:eastAsia="Malgun Gothic" w:hAnsi="Malgun Gothic"/>
+          <w:b w:val="false"/>
+          <w:bCs w:val="false"/>
+          <w:color w:val="000000"/>
+          <w:sz w:val="20"/>
+          <w:szCs w:val="20"/>
+        </w:rPr>
+        <w:t xml:space="preserve"> 의 구분으로 계산된 값인데, 교체된 문구가 이를 "</w:t>
+      </w:r>
+      <w:r>
+        <w:rPr>
+          <w:rFonts w:ascii="Malgun Gothic" w:cs="Malgun Gothic" w:eastAsia="Malgun Gothic" w:hAnsi="Malgun Gothic"/>
+          <w:b/>
+          <w:bCs/>
+          <w:color w:val="000000"/>
+          <w:sz w:val="20"/>
+          <w:szCs w:val="20"/>
+        </w:rPr>
+        <w:t xml:space="preserve">서로 다른 registry family</w:t>
+      </w:r>
+      <w:r>
+        <w:rPr>
+          <w:rFonts w:ascii="Malgun Gothic" w:cs="Malgun Gothic" w:eastAsia="Malgun Gothic" w:hAnsi="Malgun Gothic"/>
+          <w:b w:val="false"/>
+          <w:bCs w:val="false"/>
+          <w:color w:val="000000"/>
+          <w:sz w:val="20"/>
+          <w:szCs w:val="20"/>
+        </w:rPr>
+        <w:t xml:space="preserve">에서 온 둘 이상"으로 서술해 조건을 더 좁게 표현하고 있었음. 실제로 재계산하면 서로 다른 registry family가 2개 이상인 cell은 </w:t>
+      </w:r>
+      <w:r>
+        <w:rPr>
+          <w:rFonts w:ascii="Malgun Gothic" w:cs="Malgun Gothic" w:eastAsia="Malgun Gothic" w:hAnsi="Malgun Gothic"/>
+          <w:b/>
+          <w:bCs/>
+          <w:color w:val="000000"/>
+          <w:sz w:val="20"/>
+          <w:szCs w:val="20"/>
+        </w:rPr>
+        <w:t xml:space="preserve">27개</w:t>
+      </w:r>
+      <w:r>
+        <w:rPr>
+          <w:rFonts w:ascii="Malgun Gothic" w:cs="Malgun Gothic" w:eastAsia="Malgun Gothic" w:hAnsi="Malgun Gothic"/>
+          <w:b w:val="false"/>
+          <w:bCs w:val="false"/>
+          <w:color w:val="000000"/>
+          <w:sz w:val="20"/>
+          <w:szCs w:val="20"/>
+        </w:rPr>
+        <w:t xml:space="preserve">(38개의 부분집합, 나머지 11개는 같은 family 내 복수 연구)이므로, 본문을 "</w:t>
+      </w:r>
+      <w:r>
+        <w:rPr>
+          <w:rFonts w:ascii="Malgun Gothic" w:cs="Malgun Gothic" w:eastAsia="Malgun Gothic" w:hAnsi="Malgun Gothic"/>
+          <w:b/>
+          <w:bCs/>
+          <w:color w:val="000000"/>
+          <w:sz w:val="20"/>
+          <w:szCs w:val="20"/>
+        </w:rPr>
+        <w:t xml:space="preserve">2편 이상이 채울 수 있었던 cell 38개(그중 27개는 서로 다른 registry family 2개 이상에서 옴) 대 1편뿐인 47개</w:t>
+      </w:r>
+      <w:r>
+        <w:rPr>
+          <w:rFonts w:ascii="Malgun Gothic" w:cs="Malgun Gothic" w:eastAsia="Malgun Gothic" w:hAnsi="Malgun Gothic"/>
+          <w:b w:val="false"/>
+          <w:bCs w:val="false"/>
+          <w:color w:val="000000"/>
+          <w:sz w:val="20"/>
+          <w:szCs w:val="20"/>
+        </w:rPr>
+        <w:t xml:space="preserve">"로 두 수치를 모두 제시하도록 수정. 이어지는 "레지스트리 중첩으로 서로 다른 family도 완전히 독립적이지는 않다"는 단서는 그대로 유지. Results의 narrative 서술에 있던 "no </w:t>
       </w:r>
       <w:r>
         <w:rPr>

</xml_diff>

<commit_message>
State the page size and honour the page breaks in the figure section
The manuscript document set no page size, so Word rendered it Letter and
LibreOffice A4; A4 is a quarter inch narrower, which is enough to push a
figure past the margin. Fix the size to Letter on all three sections and
fit the figures to the narrower of the two printable areas, so the pages
hold either way.

The figure section also dropped the page-break markers, which left the
Figure 2 heading at the foot of one page with its figure on the next.
Emit them.

Verified by converting the document: Figure 2's heading, the whole plot
including all seven AI/AN regions, and the full Note now sit on one page
with nothing clipped, and Figures 1 and 3 stay inside the margins.

Co-Authored-By: Claude Opus 5 <noreply@anthropic.com>
Claude-Session: https://claude.ai/code/session_01CuLT4FKRBtsU22Vwfjj2qn
</commit_message>
<xml_diff>
--- a/meta_agents/search_v2/outputs/Feedback5_Response.docx
+++ b/meta_agents/search_v2/outputs/Feedback5_Response.docx
@@ -3184,6 +3184,180 @@
           <w:szCs w:val="20"/>
         </w:rPr>
         <w:t xml:space="preserve">으로 옮겨 페이지에 맞춰 흐르도록 하고, 중복되던 그림 내부 제목도 제거(그림 제목은 Figure 2 heading이 이미 담고 있음).</w:t>
+      </w:r>
+    </w:p>
+    <w:p>
+      <w:pPr>
+        <w:pStyle w:val="ListParagraph"/>
+        <w:numPr>
+          <w:ilvl w:val="0"/>
+          <w:numId w:val="1"/>
+        </w:numPr>
+        <w:spacing w:after="80" w:line="276"/>
+      </w:pPr>
+      <w:r>
+        <w:rPr>
+          <w:rFonts w:ascii="Malgun Gothic" w:cs="Malgun Gothic" w:eastAsia="Malgun Gothic" w:hAnsi="Malgun Gothic"/>
+          <w:b/>
+          <w:bCs/>
+          <w:color w:val="000000"/>
+          <w:sz w:val="20"/>
+          <w:szCs w:val="20"/>
+        </w:rPr>
+        <w:t xml:space="preserve">용지 크기 미지정 문제 발견·수정</w:t>
+      </w:r>
+      <w:r>
+        <w:rPr>
+          <w:rFonts w:ascii="Malgun Gothic" w:cs="Malgun Gothic" w:eastAsia="Malgun Gothic" w:hAnsi="Malgun Gothic"/>
+          <w:b w:val="false"/>
+          <w:bCs w:val="false"/>
+          <w:color w:val="000000"/>
+          <w:sz w:val="20"/>
+          <w:szCs w:val="20"/>
+        </w:rPr>
+        <w:t xml:space="preserve">: 제출 문서(Manuscript)가 </w:t>
+      </w:r>
+      <w:r>
+        <w:rPr>
+          <w:rFonts w:ascii="Malgun Gothic" w:cs="Malgun Gothic" w:eastAsia="Malgun Gothic" w:hAnsi="Malgun Gothic"/>
+          <w:b/>
+          <w:bCs/>
+          <w:color w:val="000000"/>
+          <w:sz w:val="20"/>
+          <w:szCs w:val="20"/>
+        </w:rPr>
+        <w:t xml:space="preserve">용지 크기를 지정하지 않고</w:t>
+      </w:r>
+      <w:r>
+        <w:rPr>
+          <w:rFonts w:ascii="Malgun Gothic" w:cs="Malgun Gothic" w:eastAsia="Malgun Gothic" w:hAnsi="Malgun Gothic"/>
+          <w:b w:val="false"/>
+          <w:bCs w:val="false"/>
+          <w:color w:val="000000"/>
+          <w:sz w:val="20"/>
+          <w:szCs w:val="20"/>
+        </w:rPr>
+        <w:t xml:space="preserve"> 있었음. Word는 Letter, LibreOffice 등 변환기는 A4를 기본값으로 삼기 때문에 </w:t>
+      </w:r>
+      <w:r>
+        <w:rPr>
+          <w:rFonts w:ascii="Malgun Gothic" w:cs="Malgun Gothic" w:eastAsia="Malgun Gothic" w:hAnsi="Malgun Gothic"/>
+          <w:b/>
+          <w:bCs/>
+          <w:color w:val="000000"/>
+          <w:sz w:val="20"/>
+          <w:szCs w:val="20"/>
+        </w:rPr>
+        <w:t xml:space="preserve">같은 파일이 변환 도구에 따라 다르게 페이지가 나뉘고</w:t>
+      </w:r>
+      <w:r>
+        <w:rPr>
+          <w:rFonts w:ascii="Malgun Gothic" w:cs="Malgun Gothic" w:eastAsia="Malgun Gothic" w:hAnsi="Malgun Gothic"/>
+          <w:b w:val="false"/>
+          <w:bCs w:val="false"/>
+          <w:color w:val="000000"/>
+          <w:sz w:val="20"/>
+          <w:szCs w:val="20"/>
+        </w:rPr>
+        <w:t xml:space="preserve">, A4는 인쇄 가능 폭이 Letter보다 0.25인치 좁아 그림이 더 쉽게 넘침. 세 섹션 모두 Letter로 명시하고, 그림 크기는 Letter·A4 중 </w:t>
+      </w:r>
+      <w:r>
+        <w:rPr>
+          <w:rFonts w:ascii="Malgun Gothic" w:cs="Malgun Gothic" w:eastAsia="Malgun Gothic" w:hAnsi="Malgun Gothic"/>
+          <w:b/>
+          <w:bCs/>
+          <w:color w:val="000000"/>
+          <w:sz w:val="20"/>
+          <w:szCs w:val="20"/>
+        </w:rPr>
+        <w:t xml:space="preserve">좁은 쪽 기준</w:t>
+      </w:r>
+      <w:r>
+        <w:rPr>
+          <w:rFonts w:ascii="Malgun Gothic" w:cs="Malgun Gothic" w:eastAsia="Malgun Gothic" w:hAnsi="Malgun Gothic"/>
+          <w:b w:val="false"/>
+          <w:bCs w:val="false"/>
+          <w:color w:val="000000"/>
+          <w:sz w:val="20"/>
+          <w:szCs w:val="20"/>
+        </w:rPr>
+        <w:t xml:space="preserve">으로 맞춰 어느 용지로 변환해도 넘치지 않도록 함. 아울러 그림 섹션이 페이지 나눔 표시를 무시하고 있어 </w:t>
+      </w:r>
+      <w:r>
+        <w:rPr>
+          <w:rFonts w:ascii="Malgun Gothic" w:cs="Malgun Gothic" w:eastAsia="Malgun Gothic" w:hAnsi="Malgun Gothic"/>
+          <w:b/>
+          <w:bCs/>
+          <w:color w:val="000000"/>
+          <w:sz w:val="20"/>
+          <w:szCs w:val="20"/>
+        </w:rPr>
+        <w:t xml:space="preserve">Figure 2 제목만 앞 페이지 하단에 남고 그림은 다음 페이지로 밀리는</w:t>
+      </w:r>
+      <w:r>
+        <w:rPr>
+          <w:rFonts w:ascii="Malgun Gothic" w:cs="Malgun Gothic" w:eastAsia="Malgun Gothic" w:hAnsi="Malgun Gothic"/>
+          <w:b w:val="false"/>
+          <w:bCs w:val="false"/>
+          <w:color w:val="000000"/>
+          <w:sz w:val="20"/>
+          <w:szCs w:val="20"/>
+        </w:rPr>
+        <w:t xml:space="preserve"> 현상이 있어 페이지 나눔을 반영하도록 수정.</w:t>
+      </w:r>
+    </w:p>
+    <w:p>
+      <w:pPr>
+        <w:pStyle w:val="ListParagraph"/>
+        <w:numPr>
+          <w:ilvl w:val="0"/>
+          <w:numId w:val="1"/>
+        </w:numPr>
+        <w:spacing w:after="80" w:line="276"/>
+      </w:pPr>
+      <w:r>
+        <w:rPr>
+          <w:rFonts w:ascii="Malgun Gothic" w:cs="Malgun Gothic" w:eastAsia="Malgun Gothic" w:hAnsi="Malgun Gothic"/>
+          <w:b/>
+          <w:bCs/>
+          <w:color w:val="000000"/>
+          <w:sz w:val="20"/>
+          <w:szCs w:val="20"/>
+        </w:rPr>
+        <w:t xml:space="preserve">실제 PDF로 확인</w:t>
+      </w:r>
+      <w:r>
+        <w:rPr>
+          <w:rFonts w:ascii="Malgun Gothic" w:cs="Malgun Gothic" w:eastAsia="Malgun Gothic" w:hAnsi="Malgun Gothic"/>
+          <w:b w:val="false"/>
+          <w:bCs w:val="false"/>
+          <w:color w:val="000000"/>
+          <w:sz w:val="20"/>
+          <w:szCs w:val="20"/>
+        </w:rPr>
+        <w:t xml:space="preserve">: 수정본을 PDF로 변환해 해당 페이지를 직접 확인 — Figure 2는 </w:t>
+      </w:r>
+      <w:r>
+        <w:rPr>
+          <w:rFonts w:ascii="Malgun Gothic" w:cs="Malgun Gothic" w:eastAsia="Malgun Gothic" w:hAnsi="Malgun Gothic"/>
+          <w:b/>
+          <w:bCs/>
+          <w:color w:val="000000"/>
+          <w:sz w:val="20"/>
+          <w:szCs w:val="20"/>
+        </w:rPr>
+        <w:t xml:space="preserve">제목·그림 전체(AI/AN 7개 지역 포함)·Note 전문이 한 페이지 안에</w:t>
+      </w:r>
+      <w:r>
+        <w:rPr>
+          <w:rFonts w:ascii="Malgun Gothic" w:cs="Malgun Gothic" w:eastAsia="Malgun Gothic" w:hAnsi="Malgun Gothic"/>
+          <w:b w:val="false"/>
+          <w:bCs w:val="false"/>
+          <w:color w:val="000000"/>
+          <w:sz w:val="20"/>
+          <w:szCs w:val="20"/>
+        </w:rPr>
+        <w:t xml:space="preserve"> 들어가고 잘리는 부분이 없음. Figure 1·3도 인쇄 영역 안에 들어감.</w:t>
       </w:r>
     </w:p>
     <w:p>

</xml_diff>

<commit_message>
Drop the blank last page from the supplementary
The supplementary builder ends with a portrait section for figures, but
the supplementary has none, so the empty section printed a blank page.
Emit the section only when there is something to put in it: 39 pages
down to 38.

Checked the rest of the supplementary against the same concerns as the
main text by converting it: the page size was already stated, all nine
tables fit the landscape printable width (the widest, Table 4, uses 9.65
of 10 inches), and every one of Supplementary Table 4's 222 value cells
matches a ledger value.

Co-Authored-By: Claude Opus 5 <noreply@anthropic.com>
Claude-Session: https://claude.ai/code/session_01CuLT4FKRBtsU22Vwfjj2qn
</commit_message>
<xml_diff>
--- a/meta_agents/search_v2/outputs/Feedback5_Response.docx
+++ b/meta_agents/search_v2/outputs/Feedback5_Response.docx
@@ -3358,6 +3358,82 @@
           <w:szCs w:val="20"/>
         </w:rPr>
         <w:t xml:space="preserve"> 들어가고 잘리는 부분이 없음. Figure 1·3도 인쇄 영역 안에 들어감.</w:t>
+      </w:r>
+    </w:p>
+    <w:p>
+      <w:pPr>
+        <w:pStyle w:val="ListParagraph"/>
+        <w:numPr>
+          <w:ilvl w:val="0"/>
+          <w:numId w:val="1"/>
+        </w:numPr>
+        <w:spacing w:after="80" w:line="276"/>
+      </w:pPr>
+      <w:r>
+        <w:rPr>
+          <w:rFonts w:ascii="Malgun Gothic" w:cs="Malgun Gothic" w:eastAsia="Malgun Gothic" w:hAnsi="Malgun Gothic"/>
+          <w:b/>
+          <w:bCs/>
+          <w:color w:val="000000"/>
+          <w:sz w:val="20"/>
+          <w:szCs w:val="20"/>
+        </w:rPr>
+        <w:t xml:space="preserve">보충자료 점검</w:t>
+      </w:r>
+      <w:r>
+        <w:rPr>
+          <w:rFonts w:ascii="Malgun Gothic" w:cs="Malgun Gothic" w:eastAsia="Malgun Gothic" w:hAnsi="Malgun Gothic"/>
+          <w:b w:val="false"/>
+          <w:bCs w:val="false"/>
+          <w:color w:val="000000"/>
+          <w:sz w:val="20"/>
+          <w:szCs w:val="20"/>
+        </w:rPr>
+        <w:t xml:space="preserve">: 같은 기준으로 Supplementary_Materials도 PDF 변환해 전수 확인 — 용지 크기는 이미 Letter로 명시돼 있었고, 표 9개의 열 너비 합계가 모두 가로 페이지 인쇄 폭(10인치) 이내여서 </w:t>
+      </w:r>
+      <w:r>
+        <w:rPr>
+          <w:rFonts w:ascii="Malgun Gothic" w:cs="Malgun Gothic" w:eastAsia="Malgun Gothic" w:hAnsi="Malgun Gothic"/>
+          <w:b/>
+          <w:bCs/>
+          <w:color w:val="000000"/>
+          <w:sz w:val="20"/>
+          <w:szCs w:val="20"/>
+        </w:rPr>
+        <w:t xml:space="preserve">가로로 잘리는 표는 없음</w:t>
+      </w:r>
+      <w:r>
+        <w:rPr>
+          <w:rFonts w:ascii="Malgun Gothic" w:cs="Malgun Gothic" w:eastAsia="Malgun Gothic" w:hAnsi="Malgun Gothic"/>
+          <w:b w:val="false"/>
+          <w:bCs w:val="false"/>
+          <w:color w:val="000000"/>
+          <w:sz w:val="20"/>
+          <w:szCs w:val="20"/>
+        </w:rPr>
+        <w:t xml:space="preserve">(최대 Table 4 = 9.65인치). Table 6a의 변경 전후 연구 병기(예: Native Hawaiian 1.270 Gomez 2026 → 1.211 Miller 2008)도 정상 출력. Supplementary Table 4의 값 셀 222개가 모두 추출표의 값과 일치함을 대조로 확인. 다만 </w:t>
+      </w:r>
+      <w:r>
+        <w:rPr>
+          <w:rFonts w:ascii="Malgun Gothic" w:cs="Malgun Gothic" w:eastAsia="Malgun Gothic" w:hAnsi="Malgun Gothic"/>
+          <w:b/>
+          <w:bCs/>
+          <w:color w:val="000000"/>
+          <w:sz w:val="20"/>
+          <w:szCs w:val="20"/>
+        </w:rPr>
+        <w:t xml:space="preserve">문서 끝에 빈 페이지 1장</w:t>
+      </w:r>
+      <w:r>
+        <w:rPr>
+          <w:rFonts w:ascii="Malgun Gothic" w:cs="Malgun Gothic" w:eastAsia="Malgun Gothic" w:hAnsi="Malgun Gothic"/>
+          <w:b w:val="false"/>
+          <w:bCs w:val="false"/>
+          <w:color w:val="000000"/>
+          <w:sz w:val="20"/>
+          <w:szCs w:val="20"/>
+        </w:rPr>
+        <w:t xml:space="preserve">이 붙고 있었음 — 그림 전용 세로 섹션을 보충자료에도 두었는데 보충자료에는 그림이 없어 빈 섹션이 페이지 하나를 만들고 있었음. 그림이 없으면 섹션 자체를 만들지 않도록 수정(39쪽 → 38쪽).</w:t>
       </w:r>
     </w:p>
     <w:p>

</xml_diff>

<commit_message>
Check Table 1 against what Figure 2 actually draws
Figure 2 names its rows by hand, so comparing Table 1 with the figure's
input file leaves a gap: a row that points at the wrong cell, or is left
out altogether, passes. That gap is what let the four AI/AN regional
point estimates be missing from the figure while its input file looked
fine.

forest_main.py now records the rows it drew, and check I pairs each with
its Table 1 cell on value, interval, and both markers — 65 comparisons,
the 38 table cells and the 27 drawn rows. Verified the check bites by
feeding it a wrong value, an invented interval and a dropped dagger: all
three were reported.

All 27 drawn rows match: the four added regions read as point estimates
exactly as the table does, and the single dagger is Alaska Native in both.

Co-Authored-By: Claude Opus 5 <noreply@anthropic.com>
Claude-Session: https://claude.ai/code/session_01CuLT4FKRBtsU22Vwfjj2qn
</commit_message>
<xml_diff>
--- a/meta_agents/search_v2/outputs/Feedback5_Response.docx
+++ b/meta_agents/search_v2/outputs/Feedback5_Response.docx
@@ -3454,6 +3454,49 @@
           <w:sz w:val="20"/>
           <w:szCs w:val="20"/>
         </w:rPr>
+        <w:t xml:space="preserve">지역값·비교군 표시 일치 확인</w:t>
+      </w:r>
+      <w:r>
+        <w:rPr>
+          <w:rFonts w:ascii="Malgun Gothic" w:cs="Malgun Gothic" w:eastAsia="Malgun Gothic" w:hAnsi="Malgun Gothic"/>
+          <w:b w:val="false"/>
+          <w:bCs w:val="false"/>
+          <w:color w:val="000000"/>
+          <w:sz w:val="20"/>
+          <w:szCs w:val="20"/>
+        </w:rPr>
+        <w:t xml:space="preserve">: Figure 2가 실제로 그린 27개 행 전부를 Table 1과 1:1 대조 — 새로 넣은 AI/AN 지역 4건(Southwest 0.57·East 0.61·Pacific Coast 0.93·Northern Plains 1.05)이 모두 "(point est.)"로 표와 동일하게 표시되고, † 표기는 Alaska Native 1.09 [0.99–1.21] 한 건으로 표·그림이 일치하며 그 외 행에 잘못 붙은 †는 없음. ‡ 표기(리뷰 계산 구간)도 전 행 일치. </w:t>
+      </w:r>
+      <w:r>
+        <w:rPr>
+          <w:rFonts w:ascii="Malgun Gothic" w:cs="Malgun Gothic" w:eastAsia="Malgun Gothic" w:hAnsi="Malgun Gothic"/>
+          <w:b/>
+          <w:bCs/>
+          <w:color w:val="000000"/>
+          <w:sz w:val="20"/>
+          <w:szCs w:val="20"/>
+        </w:rPr>
+        <w:t xml:space="preserve">불일치 0건.</w:t>
+      </w:r>
+    </w:p>
+    <w:p>
+      <w:pPr>
+        <w:pStyle w:val="ListParagraph"/>
+        <w:numPr>
+          <w:ilvl w:val="0"/>
+          <w:numId w:val="1"/>
+        </w:numPr>
+        <w:spacing w:after="80" w:line="276"/>
+      </w:pPr>
+      <w:r>
+        <w:rPr>
+          <w:rFonts w:ascii="Malgun Gothic" w:cs="Malgun Gothic" w:eastAsia="Malgun Gothic" w:hAnsi="Malgun Gothic"/>
+          <w:b/>
+          <w:bCs/>
+          <w:color w:val="000000"/>
+          <w:sz w:val="20"/>
+          <w:szCs w:val="20"/>
+        </w:rPr>
         <w:t xml:space="preserve">재발 방지 점검 추가</w:t>
       </w:r>
       <w:r>
@@ -3487,29 +3530,95 @@
           <w:sz w:val="20"/>
           <w:szCs w:val="20"/>
         </w:rPr>
-        <w:t xml:space="preserve"> 항목을 신설 — Table 1의 38개 cell 각각에 대해 그림 데이터의 </w:t>
-      </w:r>
-      <w:r>
-        <w:rPr>
-          <w:rFonts w:ascii="Malgun Gothic" w:cs="Malgun Gothic" w:eastAsia="Malgun Gothic" w:hAnsi="Malgun Gothic"/>
-          <w:b/>
-          <w:bCs/>
-          <w:color w:val="000000"/>
-          <w:sz w:val="20"/>
-          <w:szCs w:val="20"/>
-        </w:rPr>
-        <w:t xml:space="preserve">값·구간·† 표기·‡ 표기 네 가지가 모두 일치</w:t>
-      </w:r>
-      <w:r>
-        <w:rPr>
-          <w:rFonts w:ascii="Malgun Gothic" w:cs="Malgun Gothic" w:eastAsia="Malgun Gothic" w:hAnsi="Malgun Gothic"/>
-          <w:b w:val="false"/>
-          <w:bCs w:val="false"/>
-          <w:color w:val="000000"/>
-          <w:sz w:val="20"/>
-          <w:szCs w:val="20"/>
-        </w:rPr>
-        <w:t xml:space="preserve">하는지 검사하며, 어느 하나라도 다르면 실패 처리. 현재 38/38 통과. 대조를 정확히 하기 위해 Table 1 출력에 analytic dimension 열을 추가(표의 섹션 제목은 표시용이라 AANHPI가 두 섹션으로 나뉘어 있었음). 전체 교차점검 A–I 전부 통과.</w:t>
+        <w:t xml:space="preserve"> 항목을 신설 — Table 1의 38개 cell과 </w:t>
+      </w:r>
+      <w:r>
+        <w:rPr>
+          <w:rFonts w:ascii="Malgun Gothic" w:cs="Malgun Gothic" w:eastAsia="Malgun Gothic" w:hAnsi="Malgun Gothic"/>
+          <w:b/>
+          <w:bCs/>
+          <w:color w:val="000000"/>
+          <w:sz w:val="20"/>
+          <w:szCs w:val="20"/>
+        </w:rPr>
+        <w:t xml:space="preserve">Figure 2가 실제로 그린 27개 행</w:t>
+      </w:r>
+      <w:r>
+        <w:rPr>
+          <w:rFonts w:ascii="Malgun Gothic" w:cs="Malgun Gothic" w:eastAsia="Malgun Gothic" w:hAnsi="Malgun Gothic"/>
+          <w:b w:val="false"/>
+          <w:bCs w:val="false"/>
+          <w:color w:val="000000"/>
+          <w:sz w:val="20"/>
+          <w:szCs w:val="20"/>
+        </w:rPr>
+        <w:t xml:space="preserve">을 각각 </w:t>
+      </w:r>
+      <w:r>
+        <w:rPr>
+          <w:rFonts w:ascii="Malgun Gothic" w:cs="Malgun Gothic" w:eastAsia="Malgun Gothic" w:hAnsi="Malgun Gothic"/>
+          <w:b/>
+          <w:bCs/>
+          <w:color w:val="000000"/>
+          <w:sz w:val="20"/>
+          <w:szCs w:val="20"/>
+        </w:rPr>
+        <w:t xml:space="preserve">값·구간·† 표기·‡ 표기 네 가지 모두</w:t>
+      </w:r>
+      <w:r>
+        <w:rPr>
+          <w:rFonts w:ascii="Malgun Gothic" w:cs="Malgun Gothic" w:eastAsia="Malgun Gothic" w:hAnsi="Malgun Gothic"/>
+          <w:b w:val="false"/>
+          <w:bCs w:val="false"/>
+          <w:color w:val="000000"/>
+          <w:sz w:val="20"/>
+          <w:szCs w:val="20"/>
+        </w:rPr>
+        <w:t xml:space="preserve"> 대조(총 65건). Figure 2는 행 목록을 코드에 직접 적는 방식이라 입력 파일만 대조하면 *행이 빠지거나 다른 cell을 가리키는* 오류를 못 잡으므로, 그림 생성 시 </w:t>
+      </w:r>
+      <w:r>
+        <w:rPr>
+          <w:rFonts w:ascii="Malgun Gothic" w:cs="Malgun Gothic" w:eastAsia="Malgun Gothic" w:hAnsi="Malgun Gothic"/>
+          <w:b/>
+          <w:bCs/>
+          <w:color w:val="000000"/>
+          <w:sz w:val="20"/>
+          <w:szCs w:val="20"/>
+        </w:rPr>
+        <w:t xml:space="preserve">실제로 그린 내용을 별도 파일로 남기고</w:t>
+      </w:r>
+      <w:r>
+        <w:rPr>
+          <w:rFonts w:ascii="Malgun Gothic" w:cs="Malgun Gothic" w:eastAsia="Malgun Gothic" w:hAnsi="Malgun Gothic"/>
+          <w:b w:val="false"/>
+          <w:bCs w:val="false"/>
+          <w:color w:val="000000"/>
+          <w:sz w:val="20"/>
+          <w:szCs w:val="20"/>
+        </w:rPr>
+        <w:t xml:space="preserve"> 그것을 검사 대상으로 삼음. 검사가 실제로 작동하는지는 고의로 값·구간·† 세 가지를 틀리게 넣어 </w:t>
+      </w:r>
+      <w:r>
+        <w:rPr>
+          <w:rFonts w:ascii="Malgun Gothic" w:cs="Malgun Gothic" w:eastAsia="Malgun Gothic" w:hAnsi="Malgun Gothic"/>
+          <w:b/>
+          <w:bCs/>
+          <w:color w:val="000000"/>
+          <w:sz w:val="20"/>
+          <w:szCs w:val="20"/>
+        </w:rPr>
+        <w:t xml:space="preserve">3건 모두 검출됨</w:t>
+      </w:r>
+      <w:r>
+        <w:rPr>
+          <w:rFonts w:ascii="Malgun Gothic" w:cs="Malgun Gothic" w:eastAsia="Malgun Gothic" w:hAnsi="Malgun Gothic"/>
+          <w:b w:val="false"/>
+          <w:bCs w:val="false"/>
+          <w:color w:val="000000"/>
+          <w:sz w:val="20"/>
+          <w:szCs w:val="20"/>
+        </w:rPr>
+        <w:t xml:space="preserve">을 확인. 현재 65/65 통과. 대조를 정확히 하기 위해 Table 1 출력에 analytic dimension 열을 추가(표의 섹션 제목은 표시용이라 AANHPI가 두 섹션으로 나뉘어 있었음). 전체 교차점검 A–I 전부 통과.</w:t>
       </w:r>
     </w:p>
     <w:sectPr>

</xml_diff>

<commit_message>
Say in Methods that the rating rule is this review's, not the checklist's
The checklist marks each item Yes, No or Unclear and leaves the summary
judgement to the reviewer — it prescribes no threshold and designates no
item as key. Methods gave the thresholds and the two key items without
saying whose they were, which reads as though JBI set them. State that
the rule was set for this review. This is reporting what was done, not
defending it.

Also drop "operationalized" from the response, where it was describing
this same rule; "judged" says it without the word's other sense.

Co-Authored-By: Claude Opus 5 <noreply@anthropic.com>
Claude-Session: https://claude.ai/code/session_01CuLT4FKRBtsU22Vwfjj2qn
</commit_message>
<xml_diff>
--- a/meta_agents/search_v2/outputs/Feedback5_Response.docx
+++ b/meta_agents/search_v2/outputs/Feedback5_Response.docx
@@ -1909,7 +1909,7 @@
           <w:sz w:val="20"/>
           <w:szCs w:val="20"/>
         </w:rPr>
-        <w:t xml:space="preserve">이므로, 분산 요건을 Q8에서 떼어내는 것은 체크리스트 해설로부터의 이탈이 되며 그만큼 별도 정당화가 필요해집니다. 현행(분산 요건을 Q8 안에 유지)이 도구의 지침을 그대로 따르는 쪽입니다. 이 근거는 응답서에만 두고 Methods에는 넣지 않았습니다 — Methods는 실제로 수행한 바만 적고 선택을 변론하지 않는다는 원칙에 따른 것이며, Q8을 '명시된 표준인구로의 연령표준화 + 분산'으로 조작화했다는 사실 자체는 이미 Methods에 기술돼 있습니다.</w:t>
+        <w:t xml:space="preserve">이므로, 분산 요건을 Q8에서 떼어내는 것은 체크리스트 해설로부터의 이탈이 되며 그만큼 별도 정당화가 필요해집니다. 현행(분산 요건을 Q8 안에 유지)이 도구의 지침을 그대로 따르는 쪽입니다. 이 근거는 응답서에만 두고 Methods에는 넣지 않았습니다 — Methods는 실제로 수행한 바만 적고 선택을 변론하지 않는다는 원칙에 따른 것이며, Q8을 '명시된 표준인구로의 연령표준화 + 분산'으로 판정했다는 사실 자체는 이미 Methods에 기술돼 있습니다.</w:t>
       </w:r>
     </w:p>
     <w:p>
@@ -1925,7 +1925,7 @@
           <w:sz w:val="20"/>
           <w:szCs w:val="20"/>
         </w:rPr>
-        <w:t xml:space="preserve">  참고로 일반론으로는 비뚤림 위험과 정밀도(imprecision)를 별개로 다루는 것도 표준적이며(GRADE가 imprecision을 독립 영역으로 둠), prevalence 문헌에도 JBI 항목을 조작적으로 수정한 선례가 있습니다 — SeroTracker-RoB(Bobrovitz 외, *Res Synth Methods* 2023;14:414-426)는 JBI Q8을 '검사 특성 보정'과 '인구 특성 보정' 두 항목으로 </w:t>
+        <w:t xml:space="preserve">  참고로 일반론으로는 비뚤림 위험과 정밀도(imprecision)를 별개로 다루는 것도 표준적이며(GRADE가 imprecision을 독립 영역으로 둠), prevalence 문헌에도 JBI 항목을 적용 가능한 형태로 고쳐 쓴 선례가 있습니다 — SeroTracker-RoB(Bobrovitz 외, *Res Synth Methods* 2023;14:414-426)는 JBI Q8을 '검사 특성 보정'과 '인구 특성 보정' 두 항목으로 </w:t>
       </w:r>
       <w:r>
         <w:rPr>

</xml_diff>

<commit_message>
Say where the daggered cells are, since Table 1 holds 38 of the 85
Giving the count as "19 of the 85" left a reader of the main text short:
Table 1 shows 38 cells, from six of the eighteen analytic dimensions, and
only five of the nineteen daggers fall in it. Counting the daggers in the
table and reading 19 below it does not add up.

Results now says the table holds 38 of the 85 and that the rest, chiefly
the other receptor subtypes and the age-specific comparisons, are in the
supplementary, and that five of the nineteen daggers appear in Table 1
and the other fourteen in Supplementary Table 4. Table 1's own note says
the same, so the table stands on its own.

Co-Authored-By: Claude Opus 5 <noreply@anthropic.com>
Claude-Session: https://claude.ai/code/session_01CuLT4FKRBtsU22Vwfjj2qn
</commit_message>
<xml_diff>
--- a/meta_agents/search_v2/outputs/Feedback5_Response.docx
+++ b/meta_agents/search_v2/outputs/Feedback5_Response.docx
@@ -4283,6 +4283,110 @@
           <w:szCs w:val="20"/>
         </w:rPr>
         <w:t xml:space="preserve">임을 확인하고 Abstract·Results 개요·Discussion 2곳을 숫자로 교체("in 19 of the 85 cells", "NHW for 66 of the 85 representatives and an unstratified White group for the other 19").</w:t>
+      </w:r>
+    </w:p>
+    <w:p>
+      <w:pPr>
+        <w:spacing w:after="120" w:line="276"/>
+      </w:pPr>
+      <w:r>
+        <w:rPr>
+          <w:rFonts w:ascii="Malgun Gothic" w:cs="Malgun Gothic" w:eastAsia="Malgun Gothic" w:hAnsi="Malgun Gothic"/>
+          <w:b w:val="false"/>
+          <w:bCs w:val="false"/>
+          <w:color w:val="000000"/>
+          <w:sz w:val="20"/>
+          <w:szCs w:val="20"/>
+        </w:rPr>
+        <w:t xml:space="preserve">  다만 </w:t>
+      </w:r>
+      <w:r>
+        <w:rPr>
+          <w:rFonts w:ascii="Malgun Gothic" w:cs="Malgun Gothic" w:eastAsia="Malgun Gothic" w:hAnsi="Malgun Gothic"/>
+          <w:b/>
+          <w:bCs/>
+          <w:color w:val="000000"/>
+          <w:sz w:val="20"/>
+          <w:szCs w:val="20"/>
+        </w:rPr>
+        <w:t xml:space="preserve">85개 중 Table 1에 실리는 것은 38개</w:t>
+      </w:r>
+      <w:r>
+        <w:rPr>
+          <w:rFonts w:ascii="Malgun Gothic" w:cs="Malgun Gothic" w:eastAsia="Malgun Gothic" w:hAnsi="Malgun Gothic"/>
+          <w:b w:val="false"/>
+          <w:bCs w:val="false"/>
+          <w:color w:val="000000"/>
+          <w:sz w:val="20"/>
+          <w:szCs w:val="20"/>
+        </w:rPr>
+        <w:t xml:space="preserve">(18개 analytic dimension 중 6개)이므로, 본문의 19라는 숫자와 Table 1에서 세어지는 † 개수가 어긋납니다. 실제로 </w:t>
+      </w:r>
+      <w:r>
+        <w:rPr>
+          <w:rFonts w:ascii="Malgun Gothic" w:cs="Malgun Gothic" w:eastAsia="Malgun Gothic" w:hAnsi="Malgun Gothic"/>
+          <w:b/>
+          <w:bCs/>
+          <w:color w:val="000000"/>
+          <w:sz w:val="20"/>
+          <w:szCs w:val="20"/>
+        </w:rPr>
+        <w:t xml:space="preserve">19개 중 Table 1에 보이는 것은 5개, 나머지 14개는 보충자료에만</w:t>
+      </w:r>
+      <w:r>
+        <w:rPr>
+          <w:rFonts w:ascii="Malgun Gothic" w:cs="Malgun Gothic" w:eastAsia="Malgun Gothic" w:hAnsi="Malgun Gothic"/>
+          <w:b w:val="false"/>
+          <w:bCs w:val="false"/>
+          <w:color w:val="000000"/>
+          <w:sz w:val="20"/>
+          <w:szCs w:val="20"/>
+        </w:rPr>
+        <w:t xml:space="preserve"> 있음. 이 점을 Results에 명시하고("marked † wherever they appear—five of them in Table 1 and the other 14 in Supplementary Table 4"), Table 1 Note에도 </w:t>
+      </w:r>
+      <w:r>
+        <w:rPr>
+          <w:rFonts w:ascii="Malgun Gothic" w:cs="Malgun Gothic" w:eastAsia="Malgun Gothic" w:hAnsi="Malgun Gothic"/>
+          <w:b/>
+          <w:bCs/>
+          <w:color w:val="000000"/>
+          <w:sz w:val="20"/>
+          <w:szCs w:val="20"/>
+        </w:rPr>
+        <w:t xml:space="preserve">이 표가 85개 중 38개를 싣는다는 점</w:t>
+      </w:r>
+      <w:r>
+        <w:rPr>
+          <w:rFonts w:ascii="Malgun Gothic" w:cs="Malgun Gothic" w:eastAsia="Malgun Gothic" w:hAnsi="Malgun Gothic"/>
+          <w:b w:val="false"/>
+          <w:bCs w:val="false"/>
+          <w:color w:val="000000"/>
+          <w:sz w:val="20"/>
+          <w:szCs w:val="20"/>
+        </w:rPr>
+        <w:t xml:space="preserve">과 </w:t>
+      </w:r>
+      <w:r>
+        <w:rPr>
+          <w:rFonts w:ascii="Malgun Gothic" w:cs="Malgun Gothic" w:eastAsia="Malgun Gothic" w:hAnsi="Malgun Gothic"/>
+          <w:b/>
+          <w:bCs/>
+          <w:color w:val="000000"/>
+          <w:sz w:val="20"/>
+          <w:szCs w:val="20"/>
+        </w:rPr>
+        <w:t xml:space="preserve">† 19개 중 5개가 이 표에 나타난다는 점</w:t>
+      </w:r>
+      <w:r>
+        <w:rPr>
+          <w:rFonts w:ascii="Malgun Gothic" w:cs="Malgun Gothic" w:eastAsia="Malgun Gothic" w:hAnsi="Malgun Gothic"/>
+          <w:b w:val="false"/>
+          <w:bCs w:val="false"/>
+          <w:color w:val="000000"/>
+          <w:sz w:val="20"/>
+          <w:szCs w:val="20"/>
+        </w:rPr>
+        <w:t xml:space="preserve">을 추가.</w:t>
       </w:r>
     </w:p>
     <w:p>

</xml_diff>

<commit_message>
There are two SIRs, not one, and neither reaches the main text
Methods, Results, the Table 6b caption, the Table 6 note and the
sensitivity code all said "the single SIR". The ledger holds two:
Goggins 2009 for Asian Indian/Pakistani women and Moore 2015 for Alaska
Native women, both against the US White population. Corrected everywhere.

Both are overlaps, so none of the 85 representatives is an SIR. Table 1's
note and the Results preamble nonetheless promised "IRR unless marked as
an SIR" — a mark the reader will never find, since the effect column
reads IRR in all 38 rows. Dropped the promise and said the estimates are
rate ratios throughout; Methods now states that neither SIR is a
representative and that both remain in Supplementary Table 4.

The 6b counts are unchanged: the filter already excluded both.

Co-Authored-By: Claude Opus 5 <noreply@anthropic.com>
Claude-Session: https://claude.ai/code/session_01CuLT4FKRBtsU22Vwfjj2qn
</commit_message>
<xml_diff>
--- a/meta_agents/search_v2/outputs/Feedback5_Response.docx
+++ b/meta_agents/search_v2/outputs/Feedback5_Response.docx
@@ -4787,6 +4787,186 @@
           <w:szCs w:val="20"/>
         </w:rPr>
         <w:t xml:space="preserve">해 붙은 것. 이 차이가 6c(NHW 비교군 제한)에서 18개는 dropped, Alaska Native만 changed(1.09 → IHS-linked 1.25)로 갈리는 이유이므로 Methods에 명시.</w:t>
+      </w:r>
+    </w:p>
+    <w:p>
+      <w:pPr>
+        <w:pStyle w:val="ListParagraph"/>
+        <w:numPr>
+          <w:ilvl w:val="0"/>
+          <w:numId w:val="1"/>
+        </w:numPr>
+        <w:spacing w:after="80" w:line="276"/>
+      </w:pPr>
+      <w:r>
+        <w:rPr>
+          <w:rFonts w:ascii="Malgun Gothic" w:cs="Malgun Gothic" w:eastAsia="Malgun Gothic" w:hAnsi="Malgun Gothic"/>
+          <w:b/>
+          <w:bCs/>
+          <w:color w:val="000000"/>
+          <w:sz w:val="20"/>
+          <w:szCs w:val="20"/>
+        </w:rPr>
+        <w:t xml:space="preserve">SIR 개수 오기 정정 및 표기 약속 삭제</w:t>
+      </w:r>
+      <w:r>
+        <w:rPr>
+          <w:rFonts w:ascii="Malgun Gothic" w:cs="Malgun Gothic" w:eastAsia="Malgun Gothic" w:hAnsi="Malgun Gothic"/>
+          <w:b w:val="false"/>
+          <w:bCs w:val="false"/>
+          <w:color w:val="000000"/>
+          <w:sz w:val="20"/>
+          <w:szCs w:val="20"/>
+        </w:rPr>
+        <w:t xml:space="preserve">: 본문·보충자료가 일관되게 </w:t>
+      </w:r>
+      <w:r>
+        <w:rPr>
+          <w:rFonts w:ascii="Malgun Gothic" w:cs="Malgun Gothic" w:eastAsia="Malgun Gothic" w:hAnsi="Malgun Gothic"/>
+          <w:b/>
+          <w:bCs/>
+          <w:color w:val="000000"/>
+          <w:sz w:val="20"/>
+          <w:szCs w:val="20"/>
+        </w:rPr>
+        <w:t xml:space="preserve">"the single SIR"</w:t>
+      </w:r>
+      <w:r>
+        <w:rPr>
+          <w:rFonts w:ascii="Malgun Gothic" w:cs="Malgun Gothic" w:eastAsia="Malgun Gothic" w:hAnsi="Malgun Gothic"/>
+          <w:b w:val="false"/>
+          <w:bCs w:val="false"/>
+          <w:color w:val="000000"/>
+          <w:sz w:val="20"/>
+          <w:szCs w:val="20"/>
+        </w:rPr>
+        <w:t xml:space="preserve">(SIR 1건)로 서술하고 있었으나 실제로는 </w:t>
+      </w:r>
+      <w:r>
+        <w:rPr>
+          <w:rFonts w:ascii="Malgun Gothic" w:cs="Malgun Gothic" w:eastAsia="Malgun Gothic" w:hAnsi="Malgun Gothic"/>
+          <w:b/>
+          <w:bCs/>
+          <w:color w:val="000000"/>
+          <w:sz w:val="20"/>
+          <w:szCs w:val="20"/>
+        </w:rPr>
+        <w:t xml:space="preserve">2건</w:t>
+      </w:r>
+      <w:r>
+        <w:rPr>
+          <w:rFonts w:ascii="Malgun Gothic" w:cs="Malgun Gothic" w:eastAsia="Malgun Gothic" w:hAnsi="Malgun Gothic"/>
+          <w:b w:val="false"/>
+          <w:bCs w:val="false"/>
+          <w:color w:val="000000"/>
+          <w:sz w:val="20"/>
+          <w:szCs w:val="20"/>
+        </w:rPr>
+        <w:t xml:space="preserve"> — Goggins 2009(Asian Indian/Pakistani, 0.61)와 </w:t>
+      </w:r>
+      <w:r>
+        <w:rPr>
+          <w:rFonts w:ascii="Malgun Gothic" w:cs="Malgun Gothic" w:eastAsia="Malgun Gothic" w:hAnsi="Malgun Gothic"/>
+          <w:b/>
+          <w:bCs/>
+          <w:color w:val="000000"/>
+          <w:sz w:val="20"/>
+          <w:szCs w:val="20"/>
+        </w:rPr>
+        <w:t xml:space="preserve">Moore 2015(Alaska Native, 1.14)</w:t>
+      </w:r>
+      <w:r>
+        <w:rPr>
+          <w:rFonts w:ascii="Malgun Gothic" w:cs="Malgun Gothic" w:eastAsia="Malgun Gothic" w:hAnsi="Malgun Gothic"/>
+          <w:b w:val="false"/>
+          <w:bCs w:val="false"/>
+          <w:color w:val="000000"/>
+          <w:sz w:val="20"/>
+          <w:szCs w:val="20"/>
+        </w:rPr>
+        <w:t xml:space="preserve">. Methods·Results·Supplementary Table 6b 캡션·6 Note·민감도 코드 주석을 모두 2건으로 정정.</w:t>
+      </w:r>
+    </w:p>
+    <w:p>
+      <w:pPr>
+        <w:spacing w:after="120" w:line="276"/>
+      </w:pPr>
+      <w:r>
+        <w:rPr>
+          <w:rFonts w:ascii="Malgun Gothic" w:cs="Malgun Gothic" w:eastAsia="Malgun Gothic" w:hAnsi="Malgun Gothic"/>
+          <w:b w:val="false"/>
+          <w:bCs w:val="false"/>
+          <w:color w:val="000000"/>
+          <w:sz w:val="20"/>
+          <w:szCs w:val="20"/>
+        </w:rPr>
+        <w:t xml:space="preserve">  아울러 </w:t>
+      </w:r>
+      <w:r>
+        <w:rPr>
+          <w:rFonts w:ascii="Malgun Gothic" w:cs="Malgun Gothic" w:eastAsia="Malgun Gothic" w:hAnsi="Malgun Gothic"/>
+          <w:b/>
+          <w:bCs/>
+          <w:color w:val="000000"/>
+          <w:sz w:val="20"/>
+          <w:szCs w:val="20"/>
+        </w:rPr>
+        <w:t xml:space="preserve">두 SIR 모두 overlap 전용이어서 85개 대표값에는 SIR이 0건</w:t>
+      </w:r>
+      <w:r>
+        <w:rPr>
+          <w:rFonts w:ascii="Malgun Gothic" w:cs="Malgun Gothic" w:eastAsia="Malgun Gothic" w:hAnsi="Malgun Gothic"/>
+          <w:b w:val="false"/>
+          <w:bCs w:val="false"/>
+          <w:color w:val="000000"/>
+          <w:sz w:val="20"/>
+          <w:szCs w:val="20"/>
+        </w:rPr>
+        <w:t xml:space="preserve">임을 확인. 그런데 Table 1 Note와 Results 머리말이 "IRR unless marked as an SIR", "or noted as an SIR"처럼 </w:t>
+      </w:r>
+      <w:r>
+        <w:rPr>
+          <w:rFonts w:ascii="Malgun Gothic" w:cs="Malgun Gothic" w:eastAsia="Malgun Gothic" w:hAnsi="Malgun Gothic"/>
+          <w:b/>
+          <w:bCs/>
+          <w:color w:val="000000"/>
+          <w:sz w:val="20"/>
+          <w:szCs w:val="20"/>
+        </w:rPr>
+        <w:t xml:space="preserve">독자가 찾을 수 없는 표기를 약속</w:t>
+      </w:r>
+      <w:r>
+        <w:rPr>
+          <w:rFonts w:ascii="Malgun Gothic" w:cs="Malgun Gothic" w:eastAsia="Malgun Gothic" w:hAnsi="Malgun Gothic"/>
+          <w:b w:val="false"/>
+          <w:bCs w:val="false"/>
+          <w:color w:val="000000"/>
+          <w:sz w:val="20"/>
+          <w:szCs w:val="20"/>
+        </w:rPr>
+        <w:t xml:space="preserve">하고 있었으므로 해당 문구를 삭제하고 "본문 추정치는 전부 IRR"로 명시. Methods에도 "Neither is the representative for its cell, so no estimate reported in the main text is an SIR"을 추가해 두 SIR이 어디에 남아 있는지(Supplementary Table 4) 분명히 함. 6b 민감도는 코드가 이미 두 건 모두 제외하고 있어 </w:t>
+      </w:r>
+      <w:r>
+        <w:rPr>
+          <w:rFonts w:ascii="Malgun Gothic" w:cs="Malgun Gothic" w:eastAsia="Malgun Gothic" w:hAnsi="Malgun Gothic"/>
+          <w:b/>
+          <w:bCs/>
+          <w:color w:val="000000"/>
+          <w:sz w:val="20"/>
+          <w:szCs w:val="20"/>
+        </w:rPr>
+        <w:t xml:space="preserve">수치는 불변</w:t>
+      </w:r>
+      <w:r>
+        <w:rPr>
+          <w:rFonts w:ascii="Malgun Gothic" w:cs="Malgun Gothic" w:eastAsia="Malgun Gothic" w:hAnsi="Malgun Gothic"/>
+          <w:b w:val="false"/>
+          <w:bCs w:val="false"/>
+          <w:color w:val="000000"/>
+          <w:sz w:val="20"/>
+          <w:szCs w:val="20"/>
+        </w:rPr>
+        <w:t xml:space="preserve">(35 unchanged / 4 changed / 46 dropped).</w:t>
       </w:r>
     </w:p>
     <w:p>

</xml_diff>